<commit_message>
Hub batch 2: remove type badge from cards; swap to circle logo; SF intake as docx download with shortened workflow-focused content; AI Tools Getting Started moved to all-staff with inline PDF embed; remove Manual Tasks Checklist, Brand Tone Intake, and Department Workflow Planner; add Back-to-top links to all training docs; remove Maintained-by-Adam line from footer; add backlog.md for tracked work
</commit_message>
<xml_diff>
--- a/dist/files/sta-salesforce-org-intake.docx
+++ b/dist/files/sta-salesforce-org-intake.docx
@@ -9,23 +9,22 @@
       <w:r>
         <w:rPr>
           <w:b/>
-          <w:color w:val="006098"/>
+          <w:color w:val="1F3A5F"/>
           <w:sz w:val="44"/>
         </w:rPr>
-        <w:t>STA Salesforce Org Intake</w:t>
+        <w:t>School Tech Salesforce Cohort - Org Intake</w:t>
       </w:r>
     </w:p>
     <w:p>
       <w:pPr>
-        <w:spacing w:after="360"/>
+        <w:spacing w:after="280"/>
       </w:pPr>
       <w:r>
         <w:rPr>
           <w:i/>
-          <w:color w:val="5A5F72"/>
-          <w:sz w:val="22"/>
+          <w:color w:val="555555"/>
         </w:rPr>
-        <w:t>For the STA Salesforce Cohort Claude.ai Project (v1.2) - fills the org-context gap in v1.0</w:t>
+        <w:t>Captures how you actually use Salesforce - your workflows, pain points, and where AI could help.</w:t>
       </w:r>
     </w:p>
     <w:p>
@@ -38,17 +37,17 @@
     </w:p>
     <w:p>
       <w:r>
-        <w:t>Fill out the sections below to give the STA Salesforce Cohort assistant the org-specific Salesforce configuration it needs. This intake is intentionally narrow - it catches Salesforce-specific structural details only. Broader workflow, decision-making, and tool questions are covered in the separate Department AI Workflow Planner; this doc deliberately avoids duplicating those questions. If you have not yet filled out the Department AI Workflow Planner, that one is also useful but not required first - either can be completed in either order.</w:t>
+        <w:t>This intake captures how you actually use Salesforce - the workflows, decisions, and pain points that make up your day. The goal is to give the School Tech Salesforce Cohort AI assistant enough context to be useful from day one. Adam will pair these answers with org metadata exported separately, so you do not need to dig into API names, custom object lists, or technical configuration.</w:t>
       </w:r>
     </w:p>
     <w:p>
       <w:r>
-        <w:t>Answer what you can; mark anything you do not know with 'not sure' and Adam will follow up. Concrete and honest beats thorough and polished. If a section does not apply to your work in Salesforce, write 'N/A.' Expected time: 20 to 30 minutes per person (trimmed from the prior version since the daily-tasks section was removed - that question lives in the Department AI Workflow Planner).</w:t>
+        <w:t>Answer in plain prose. Skip anything that does not apply to you. Concrete and honest beats thorough and polished. About 10 minutes total.</w:t>
       </w:r>
     </w:p>
     <w:p>
       <w:r>
-        <w:t>When you are done, return this file to Adam. He will package the answers into context-sta-salesforce-org.md v1.1 and re-upload the updated context file to the Project.</w:t>
+        <w:t>When you are done, share the document back with Adam.</w:t>
       </w:r>
     </w:p>
     <w:p>
@@ -56,45 +55,49 @@
         <w:pStyle w:val="Heading1"/>
       </w:pPr>
       <w:r>
-        <w:t>Section 1: Your Salesforce Access</w:t>
+        <w:t>Section 1: Your Salesforce world</w:t>
       </w:r>
     </w:p>
     <w:p>
       <w:r>
-        <w:t>Your name:</w:t>
+        <w:t>Briefly describe your role and how Salesforce fits into it. Cover:</w:t>
       </w:r>
     </w:p>
     <w:p>
+      <w:pPr>
+        <w:pStyle w:val="ListBullet"/>
+      </w:pPr>
       <w:r>
-        <w:t xml:space="preserve">&gt; </w:t>
+        <w:t>Your name and your role at School Tech</w:t>
       </w:r>
     </w:p>
     <w:p>
+      <w:pPr>
+        <w:pStyle w:val="ListBullet"/>
+      </w:pPr>
       <w:r>
-        <w:t>Which orgs do you have access to (Production, Developer Sandbox, Partial Data Sandbox)? List any access constraints:</w:t>
+        <w:t>Which Salesforce environments you log into regularly (production, any sandboxes you use)</w:t>
       </w:r>
     </w:p>
     <w:p>
+      <w:pPr>
+        <w:pStyle w:val="ListBullet"/>
+      </w:pPr>
       <w:r>
-        <w:t xml:space="preserve">&gt; </w:t>
-      </w:r>
-    </w:p>
-    <w:p>
-      <w:r>
-        <w:t>Which managed packages do you regularly use (Salesforce CPQ, Spanning Backup, others)? Note any you have access to but do not actively use:</w:t>
-      </w:r>
-    </w:p>
-    <w:p>
-      <w:r>
-        <w:t xml:space="preserve">&gt; </w:t>
+        <w:t>Any non-vanilla Salesforce tools you rely on - CPQ, Spanning Backup, AppExchange packages, integrations with other systems</w:t>
       </w:r>
     </w:p>
     <w:p>
       <w:r>
         <w:rPr>
-          <w:i/>
+          <w:b/>
         </w:rPr>
-        <w:t>Note: 'What you primarily do in your day-to-day work' is covered in the Department AI Workflow Planner Section 2 (most common tasks) - not duplicated here.</w:t>
+        <w:t>Your answer:</w:t>
+      </w:r>
+    </w:p>
+    <w:p>
+      <w:r>
+        <w:t>&gt;</w:t>
       </w:r>
     </w:p>
     <w:p>
@@ -102,300 +105,30 @@
         <w:pStyle w:val="Heading1"/>
       </w:pPr>
       <w:r>
-        <w:t>Section 2: Custom Objects</w:t>
+        <w:t>Section 2: What you actually do in Salesforce</w:t>
       </w:r>
     </w:p>
     <w:p>
       <w:r>
-        <w:t>List the custom objects you work with in Salesforce. For each, give the object name (label and API name if you know it) and one sentence on what it stores. If you do not work with custom objects, write N/A and skip to Section 3.</w:t>
-      </w:r>
-    </w:p>
-    <w:p>
-      <w:pPr>
-        <w:pStyle w:val="Heading3"/>
-      </w:pPr>
-      <w:r>
-        <w:t>Custom Object 1</w:t>
+        <w:t>In 3 to 5 sentences, describe what your Salesforce work looks like on a normal week. Write it the way you would describe it to a coworker - reports you run, records you update, screens you live in, what changes at month-end or quarter-end if anything.</w:t>
       </w:r>
     </w:p>
     <w:p>
       <w:r>
-        <w:t>Object label:</w:t>
+        <w:t>No technical detail needed. If you spend most of your Salesforce time on one or two specific tasks, say so - that focus is useful.</w:t>
       </w:r>
     </w:p>
     <w:p>
       <w:r>
-        <w:t xml:space="preserve">&gt; </w:t>
+        <w:rPr>
+          <w:b/>
+        </w:rPr>
+        <w:t>Your answer:</w:t>
       </w:r>
     </w:p>
     <w:p>
       <w:r>
-        <w:t>Object API name (if known):</w:t>
-      </w:r>
-    </w:p>
-    <w:p>
-      <w:r>
-        <w:t xml:space="preserve">&gt; </w:t>
-      </w:r>
-    </w:p>
-    <w:p>
-      <w:r>
-        <w:t>What it stores (one sentence):</w:t>
-      </w:r>
-    </w:p>
-    <w:p>
-      <w:r>
-        <w:t xml:space="preserve">&gt; </w:t>
-      </w:r>
-    </w:p>
-    <w:p>
-      <w:r>
-        <w:t>Who created/owns it (Adam, you, someone else):</w:t>
-      </w:r>
-    </w:p>
-    <w:p>
-      <w:r>
-        <w:t xml:space="preserve">&gt; </w:t>
-      </w:r>
-    </w:p>
-    <w:p>
-      <w:pPr>
-        <w:pStyle w:val="Heading3"/>
-      </w:pPr>
-      <w:r>
-        <w:t>Custom Object 2</w:t>
-      </w:r>
-    </w:p>
-    <w:p>
-      <w:r>
-        <w:t>Object label:</w:t>
-      </w:r>
-    </w:p>
-    <w:p>
-      <w:r>
-        <w:t xml:space="preserve">&gt; </w:t>
-      </w:r>
-    </w:p>
-    <w:p>
-      <w:r>
-        <w:t>Object API name (if known):</w:t>
-      </w:r>
-    </w:p>
-    <w:p>
-      <w:r>
-        <w:t xml:space="preserve">&gt; </w:t>
-      </w:r>
-    </w:p>
-    <w:p>
-      <w:r>
-        <w:t>What it stores (one sentence):</w:t>
-      </w:r>
-    </w:p>
-    <w:p>
-      <w:r>
-        <w:t xml:space="preserve">&gt; </w:t>
-      </w:r>
-    </w:p>
-    <w:p>
-      <w:r>
-        <w:t>Who created/owns it (Adam, you, someone else):</w:t>
-      </w:r>
-    </w:p>
-    <w:p>
-      <w:r>
-        <w:t xml:space="preserve">&gt; </w:t>
-      </w:r>
-    </w:p>
-    <w:p>
-      <w:pPr>
-        <w:pStyle w:val="Heading3"/>
-      </w:pPr>
-      <w:r>
-        <w:t>Custom Object 3</w:t>
-      </w:r>
-    </w:p>
-    <w:p>
-      <w:r>
-        <w:t>Object label:</w:t>
-      </w:r>
-    </w:p>
-    <w:p>
-      <w:r>
-        <w:t xml:space="preserve">&gt; </w:t>
-      </w:r>
-    </w:p>
-    <w:p>
-      <w:r>
-        <w:t>Object API name (if known):</w:t>
-      </w:r>
-    </w:p>
-    <w:p>
-      <w:r>
-        <w:t xml:space="preserve">&gt; </w:t>
-      </w:r>
-    </w:p>
-    <w:p>
-      <w:r>
-        <w:t>What it stores (one sentence):</w:t>
-      </w:r>
-    </w:p>
-    <w:p>
-      <w:r>
-        <w:t xml:space="preserve">&gt; </w:t>
-      </w:r>
-    </w:p>
-    <w:p>
-      <w:r>
-        <w:t>Who created/owns it (Adam, you, someone else):</w:t>
-      </w:r>
-    </w:p>
-    <w:p>
-      <w:r>
-        <w:t xml:space="preserve">&gt; </w:t>
-      </w:r>
-    </w:p>
-    <w:p>
-      <w:pPr>
-        <w:pStyle w:val="Heading3"/>
-      </w:pPr>
-      <w:r>
-        <w:t>Custom Object 4</w:t>
-      </w:r>
-    </w:p>
-    <w:p>
-      <w:r>
-        <w:t>Object label:</w:t>
-      </w:r>
-    </w:p>
-    <w:p>
-      <w:r>
-        <w:t xml:space="preserve">&gt; </w:t>
-      </w:r>
-    </w:p>
-    <w:p>
-      <w:r>
-        <w:t>Object API name (if known):</w:t>
-      </w:r>
-    </w:p>
-    <w:p>
-      <w:r>
-        <w:t xml:space="preserve">&gt; </w:t>
-      </w:r>
-    </w:p>
-    <w:p>
-      <w:r>
-        <w:t>What it stores (one sentence):</w:t>
-      </w:r>
-    </w:p>
-    <w:p>
-      <w:r>
-        <w:t xml:space="preserve">&gt; </w:t>
-      </w:r>
-    </w:p>
-    <w:p>
-      <w:r>
-        <w:t>Who created/owns it (Adam, you, someone else):</w:t>
-      </w:r>
-    </w:p>
-    <w:p>
-      <w:r>
-        <w:t xml:space="preserve">&gt; </w:t>
-      </w:r>
-    </w:p>
-    <w:p>
-      <w:pPr>
-        <w:pStyle w:val="Heading3"/>
-      </w:pPr>
-      <w:r>
-        <w:t>Custom Object 5</w:t>
-      </w:r>
-    </w:p>
-    <w:p>
-      <w:r>
-        <w:t>Object label:</w:t>
-      </w:r>
-    </w:p>
-    <w:p>
-      <w:r>
-        <w:t xml:space="preserve">&gt; </w:t>
-      </w:r>
-    </w:p>
-    <w:p>
-      <w:r>
-        <w:t>Object API name (if known):</w:t>
-      </w:r>
-    </w:p>
-    <w:p>
-      <w:r>
-        <w:t xml:space="preserve">&gt; </w:t>
-      </w:r>
-    </w:p>
-    <w:p>
-      <w:r>
-        <w:t>What it stores (one sentence):</w:t>
-      </w:r>
-    </w:p>
-    <w:p>
-      <w:r>
-        <w:t xml:space="preserve">&gt; </w:t>
-      </w:r>
-    </w:p>
-    <w:p>
-      <w:r>
-        <w:t>Who created/owns it (Adam, you, someone else):</w:t>
-      </w:r>
-    </w:p>
-    <w:p>
-      <w:r>
-        <w:t xml:space="preserve">&gt; </w:t>
-      </w:r>
-    </w:p>
-    <w:p>
-      <w:pPr>
-        <w:pStyle w:val="Heading3"/>
-      </w:pPr>
-      <w:r>
-        <w:t>Custom Object 6</w:t>
-      </w:r>
-    </w:p>
-    <w:p>
-      <w:r>
-        <w:t>Object label:</w:t>
-      </w:r>
-    </w:p>
-    <w:p>
-      <w:r>
-        <w:t xml:space="preserve">&gt; </w:t>
-      </w:r>
-    </w:p>
-    <w:p>
-      <w:r>
-        <w:t>Object API name (if known):</w:t>
-      </w:r>
-    </w:p>
-    <w:p>
-      <w:r>
-        <w:t xml:space="preserve">&gt; </w:t>
-      </w:r>
-    </w:p>
-    <w:p>
-      <w:r>
-        <w:t>What it stores (one sentence):</w:t>
-      </w:r>
-    </w:p>
-    <w:p>
-      <w:r>
-        <w:t xml:space="preserve">&gt; </w:t>
-      </w:r>
-    </w:p>
-    <w:p>
-      <w:r>
-        <w:t>Who created/owns it (Adam, you, someone else):</w:t>
-      </w:r>
-    </w:p>
-    <w:p>
-      <w:r>
-        <w:t xml:space="preserve">&gt; </w:t>
+        <w:t>&gt;</w:t>
       </w:r>
     </w:p>
     <w:p>
@@ -403,321 +136,30 @@
         <w:pStyle w:val="Heading1"/>
       </w:pPr>
       <w:r>
-        <w:t>Section 3: Custom Fields You Rely On</w:t>
+        <w:t>Section 3: Custom stuff that matters to you</w:t>
       </w:r>
     </w:p>
     <w:p>
       <w:r>
-        <w:t>List the custom fields you reference most often in your work - on any object. For each, give the field label, the object it lives on, and what it stores. Focus on fields you use in reports, filters, or validation rules, not every custom field that exists.</w:t>
+        <w:t>Tell me about any custom objects, fields, flows, automations, or validation rules that you bump into regularly. Use whatever names you call them - formal or informal, doesn't matter. Do not worry about API names or technical exactness.</w:t>
       </w:r>
     </w:p>
     <w:p>
       <w:r>
-        <w:t>Example: Field label: Renewal Date. Object: Account. What it stores: The date the customer's contract is up for renewal; used in renewal pipeline reports.</w:t>
-      </w:r>
-    </w:p>
-    <w:p>
-      <w:pPr>
-        <w:pStyle w:val="Heading3"/>
-      </w:pPr>
-      <w:r>
-        <w:t>Field 1</w:t>
+        <w:t>If something has ever blocked you, surprised you, or saved you significant time, flag it. If you have built a workaround - a manual process to compensate for a missing feature, or maintain a separate spreadsheet because something is hard to do in Salesforce - that is especially useful to know.</w:t>
       </w:r>
     </w:p>
     <w:p>
       <w:r>
-        <w:t>Field label:</w:t>
+        <w:rPr>
+          <w:b/>
+        </w:rPr>
+        <w:t>Your answer:</w:t>
       </w:r>
     </w:p>
     <w:p>
       <w:r>
-        <w:t xml:space="preserve">&gt; </w:t>
-      </w:r>
-    </w:p>
-    <w:p>
-      <w:r>
-        <w:t>Object it lives on:</w:t>
-      </w:r>
-    </w:p>
-    <w:p>
-      <w:r>
-        <w:t xml:space="preserve">&gt; </w:t>
-      </w:r>
-    </w:p>
-    <w:p>
-      <w:r>
-        <w:t>What it stores and where you use it:</w:t>
-      </w:r>
-    </w:p>
-    <w:p>
-      <w:r>
-        <w:t xml:space="preserve">&gt; </w:t>
-      </w:r>
-    </w:p>
-    <w:p>
-      <w:pPr>
-        <w:pStyle w:val="Heading3"/>
-      </w:pPr>
-      <w:r>
-        <w:t>Field 2</w:t>
-      </w:r>
-    </w:p>
-    <w:p>
-      <w:r>
-        <w:t>Field label:</w:t>
-      </w:r>
-    </w:p>
-    <w:p>
-      <w:r>
-        <w:t xml:space="preserve">&gt; </w:t>
-      </w:r>
-    </w:p>
-    <w:p>
-      <w:r>
-        <w:t>Object it lives on:</w:t>
-      </w:r>
-    </w:p>
-    <w:p>
-      <w:r>
-        <w:t xml:space="preserve">&gt; </w:t>
-      </w:r>
-    </w:p>
-    <w:p>
-      <w:r>
-        <w:t>What it stores and where you use it:</w:t>
-      </w:r>
-    </w:p>
-    <w:p>
-      <w:r>
-        <w:t xml:space="preserve">&gt; </w:t>
-      </w:r>
-    </w:p>
-    <w:p>
-      <w:pPr>
-        <w:pStyle w:val="Heading3"/>
-      </w:pPr>
-      <w:r>
-        <w:t>Field 3</w:t>
-      </w:r>
-    </w:p>
-    <w:p>
-      <w:r>
-        <w:t>Field label:</w:t>
-      </w:r>
-    </w:p>
-    <w:p>
-      <w:r>
-        <w:t xml:space="preserve">&gt; </w:t>
-      </w:r>
-    </w:p>
-    <w:p>
-      <w:r>
-        <w:t>Object it lives on:</w:t>
-      </w:r>
-    </w:p>
-    <w:p>
-      <w:r>
-        <w:t xml:space="preserve">&gt; </w:t>
-      </w:r>
-    </w:p>
-    <w:p>
-      <w:r>
-        <w:t>What it stores and where you use it:</w:t>
-      </w:r>
-    </w:p>
-    <w:p>
-      <w:r>
-        <w:t xml:space="preserve">&gt; </w:t>
-      </w:r>
-    </w:p>
-    <w:p>
-      <w:pPr>
-        <w:pStyle w:val="Heading3"/>
-      </w:pPr>
-      <w:r>
-        <w:t>Field 4</w:t>
-      </w:r>
-    </w:p>
-    <w:p>
-      <w:r>
-        <w:t>Field label:</w:t>
-      </w:r>
-    </w:p>
-    <w:p>
-      <w:r>
-        <w:t xml:space="preserve">&gt; </w:t>
-      </w:r>
-    </w:p>
-    <w:p>
-      <w:r>
-        <w:t>Object it lives on:</w:t>
-      </w:r>
-    </w:p>
-    <w:p>
-      <w:r>
-        <w:t xml:space="preserve">&gt; </w:t>
-      </w:r>
-    </w:p>
-    <w:p>
-      <w:r>
-        <w:t>What it stores and where you use it:</w:t>
-      </w:r>
-    </w:p>
-    <w:p>
-      <w:r>
-        <w:t xml:space="preserve">&gt; </w:t>
-      </w:r>
-    </w:p>
-    <w:p>
-      <w:pPr>
-        <w:pStyle w:val="Heading3"/>
-      </w:pPr>
-      <w:r>
-        <w:t>Field 5</w:t>
-      </w:r>
-    </w:p>
-    <w:p>
-      <w:r>
-        <w:t>Field label:</w:t>
-      </w:r>
-    </w:p>
-    <w:p>
-      <w:r>
-        <w:t xml:space="preserve">&gt; </w:t>
-      </w:r>
-    </w:p>
-    <w:p>
-      <w:r>
-        <w:t>Object it lives on:</w:t>
-      </w:r>
-    </w:p>
-    <w:p>
-      <w:r>
-        <w:t xml:space="preserve">&gt; </w:t>
-      </w:r>
-    </w:p>
-    <w:p>
-      <w:r>
-        <w:t>What it stores and where you use it:</w:t>
-      </w:r>
-    </w:p>
-    <w:p>
-      <w:r>
-        <w:t xml:space="preserve">&gt; </w:t>
-      </w:r>
-    </w:p>
-    <w:p>
-      <w:pPr>
-        <w:pStyle w:val="Heading3"/>
-      </w:pPr>
-      <w:r>
-        <w:t>Field 6</w:t>
-      </w:r>
-    </w:p>
-    <w:p>
-      <w:r>
-        <w:t>Field label:</w:t>
-      </w:r>
-    </w:p>
-    <w:p>
-      <w:r>
-        <w:t xml:space="preserve">&gt; </w:t>
-      </w:r>
-    </w:p>
-    <w:p>
-      <w:r>
-        <w:t>Object it lives on:</w:t>
-      </w:r>
-    </w:p>
-    <w:p>
-      <w:r>
-        <w:t xml:space="preserve">&gt; </w:t>
-      </w:r>
-    </w:p>
-    <w:p>
-      <w:r>
-        <w:t>What it stores and where you use it:</w:t>
-      </w:r>
-    </w:p>
-    <w:p>
-      <w:r>
-        <w:t xml:space="preserve">&gt; </w:t>
-      </w:r>
-    </w:p>
-    <w:p>
-      <w:pPr>
-        <w:pStyle w:val="Heading3"/>
-      </w:pPr>
-      <w:r>
-        <w:t>Field 7</w:t>
-      </w:r>
-    </w:p>
-    <w:p>
-      <w:r>
-        <w:t>Field label:</w:t>
-      </w:r>
-    </w:p>
-    <w:p>
-      <w:r>
-        <w:t xml:space="preserve">&gt; </w:t>
-      </w:r>
-    </w:p>
-    <w:p>
-      <w:r>
-        <w:t>Object it lives on:</w:t>
-      </w:r>
-    </w:p>
-    <w:p>
-      <w:r>
-        <w:t xml:space="preserve">&gt; </w:t>
-      </w:r>
-    </w:p>
-    <w:p>
-      <w:r>
-        <w:t>What it stores and where you use it:</w:t>
-      </w:r>
-    </w:p>
-    <w:p>
-      <w:r>
-        <w:t xml:space="preserve">&gt; </w:t>
-      </w:r>
-    </w:p>
-    <w:p>
-      <w:pPr>
-        <w:pStyle w:val="Heading3"/>
-      </w:pPr>
-      <w:r>
-        <w:t>Field 8</w:t>
-      </w:r>
-    </w:p>
-    <w:p>
-      <w:r>
-        <w:t>Field label:</w:t>
-      </w:r>
-    </w:p>
-    <w:p>
-      <w:r>
-        <w:t xml:space="preserve">&gt; </w:t>
-      </w:r>
-    </w:p>
-    <w:p>
-      <w:r>
-        <w:t>Object it lives on:</w:t>
-      </w:r>
-    </w:p>
-    <w:p>
-      <w:r>
-        <w:t xml:space="preserve">&gt; </w:t>
-      </w:r>
-    </w:p>
-    <w:p>
-      <w:r>
-        <w:t>What it stores and where you use it:</w:t>
-      </w:r>
-    </w:p>
-    <w:p>
-      <w:r>
-        <w:t xml:space="preserve">&gt; </w:t>
+        <w:t>&gt;</w:t>
       </w:r>
     </w:p>
     <w:p>
@@ -725,1204 +167,25 @@
         <w:pStyle w:val="Heading1"/>
       </w:pPr>
       <w:r>
-        <w:t>Section 4: Active Flows You Know About</w:t>
+        <w:t>Section 4: Where you want AI help first</w:t>
       </w:r>
     </w:p>
     <w:p>
       <w:r>
-        <w:t>Adam owns all Flows at STA, but you may interact with the results of specific Flows in your work (records auto-update, emails fire, approvals route, etc.). List any Flows you know exist - by name if you remember it, or by what it does if you do not. If you do not interact with any specific Flow, write N/A.</w:t>
-      </w:r>
-    </w:p>
-    <w:p>
-      <w:pPr>
-        <w:pStyle w:val="Heading3"/>
-      </w:pPr>
-      <w:r>
-        <w:t>Flow 1</w:t>
+        <w:t>If the School Tech Salesforce Cohort assistant could help you with anything in your Salesforce work, what would you ask it to do first? Two or three sentences. Concrete examples welcome - 'help me draft the renewal pipeline report explanation' is more useful than 'help with reports.'</w:t>
       </w:r>
     </w:p>
     <w:p>
       <w:r>
-        <w:t>Flow name (if known):</w:t>
+        <w:rPr>
+          <w:b/>
+        </w:rPr>
+        <w:t>Your answer:</w:t>
       </w:r>
     </w:p>
     <w:p>
       <w:r>
-        <w:t xml:space="preserve">&gt; </w:t>
-      </w:r>
-    </w:p>
-    <w:p>
-      <w:r>
-        <w:t>What it does (what you observe):</w:t>
-      </w:r>
-    </w:p>
-    <w:p>
-      <w:r>
-        <w:t xml:space="preserve">&gt; </w:t>
-      </w:r>
-    </w:p>
-    <w:p>
-      <w:r>
-        <w:t>Object/trigger (e.g., 'fires when an Order is saved'):</w:t>
-      </w:r>
-    </w:p>
-    <w:p>
-      <w:r>
-        <w:t xml:space="preserve">&gt; </w:t>
-      </w:r>
-    </w:p>
-    <w:p>
-      <w:pPr>
-        <w:pStyle w:val="Heading3"/>
-      </w:pPr>
-      <w:r>
-        <w:t>Flow 2</w:t>
-      </w:r>
-    </w:p>
-    <w:p>
-      <w:r>
-        <w:t>Flow name (if known):</w:t>
-      </w:r>
-    </w:p>
-    <w:p>
-      <w:r>
-        <w:t xml:space="preserve">&gt; </w:t>
-      </w:r>
-    </w:p>
-    <w:p>
-      <w:r>
-        <w:t>What it does (what you observe):</w:t>
-      </w:r>
-    </w:p>
-    <w:p>
-      <w:r>
-        <w:t xml:space="preserve">&gt; </w:t>
-      </w:r>
-    </w:p>
-    <w:p>
-      <w:r>
-        <w:t>Object/trigger (e.g., 'fires when an Order is saved'):</w:t>
-      </w:r>
-    </w:p>
-    <w:p>
-      <w:r>
-        <w:t xml:space="preserve">&gt; </w:t>
-      </w:r>
-    </w:p>
-    <w:p>
-      <w:pPr>
-        <w:pStyle w:val="Heading3"/>
-      </w:pPr>
-      <w:r>
-        <w:t>Flow 3</w:t>
-      </w:r>
-    </w:p>
-    <w:p>
-      <w:r>
-        <w:t>Flow name (if known):</w:t>
-      </w:r>
-    </w:p>
-    <w:p>
-      <w:r>
-        <w:t xml:space="preserve">&gt; </w:t>
-      </w:r>
-    </w:p>
-    <w:p>
-      <w:r>
-        <w:t>What it does (what you observe):</w:t>
-      </w:r>
-    </w:p>
-    <w:p>
-      <w:r>
-        <w:t xml:space="preserve">&gt; </w:t>
-      </w:r>
-    </w:p>
-    <w:p>
-      <w:r>
-        <w:t>Object/trigger (e.g., 'fires when an Order is saved'):</w:t>
-      </w:r>
-    </w:p>
-    <w:p>
-      <w:r>
-        <w:t xml:space="preserve">&gt; </w:t>
-      </w:r>
-    </w:p>
-    <w:p>
-      <w:pPr>
-        <w:pStyle w:val="Heading3"/>
-      </w:pPr>
-      <w:r>
-        <w:t>Flow 4</w:t>
-      </w:r>
-    </w:p>
-    <w:p>
-      <w:r>
-        <w:t>Flow name (if known):</w:t>
-      </w:r>
-    </w:p>
-    <w:p>
-      <w:r>
-        <w:t xml:space="preserve">&gt; </w:t>
-      </w:r>
-    </w:p>
-    <w:p>
-      <w:r>
-        <w:t>What it does (what you observe):</w:t>
-      </w:r>
-    </w:p>
-    <w:p>
-      <w:r>
-        <w:t xml:space="preserve">&gt; </w:t>
-      </w:r>
-    </w:p>
-    <w:p>
-      <w:r>
-        <w:t>Object/trigger (e.g., 'fires when an Order is saved'):</w:t>
-      </w:r>
-    </w:p>
-    <w:p>
-      <w:r>
-        <w:t xml:space="preserve">&gt; </w:t>
-      </w:r>
-    </w:p>
-    <w:p>
-      <w:pPr>
-        <w:pStyle w:val="Heading3"/>
-      </w:pPr>
-      <w:r>
-        <w:t>Flow 5</w:t>
-      </w:r>
-    </w:p>
-    <w:p>
-      <w:r>
-        <w:t>Flow name (if known):</w:t>
-      </w:r>
-    </w:p>
-    <w:p>
-      <w:r>
-        <w:t xml:space="preserve">&gt; </w:t>
-      </w:r>
-    </w:p>
-    <w:p>
-      <w:r>
-        <w:t>What it does (what you observe):</w:t>
-      </w:r>
-    </w:p>
-    <w:p>
-      <w:r>
-        <w:t xml:space="preserve">&gt; </w:t>
-      </w:r>
-    </w:p>
-    <w:p>
-      <w:r>
-        <w:t>Object/trigger (e.g., 'fires when an Order is saved'):</w:t>
-      </w:r>
-    </w:p>
-    <w:p>
-      <w:r>
-        <w:t xml:space="preserve">&gt; </w:t>
-      </w:r>
-    </w:p>
-    <w:p>
-      <w:pPr>
-        <w:pStyle w:val="Heading1"/>
-      </w:pPr>
-      <w:r>
-        <w:t>Section 5: Validation Rules You Know About</w:t>
-      </w:r>
-    </w:p>
-    <w:p>
-      <w:r>
-        <w:t>Validation rules block saves when certain conditions are met (e.g., 'cannot close a Case without a Description'). List rules you know exist - especially any that have blocked you or your team at some point.</w:t>
-      </w:r>
-    </w:p>
-    <w:p>
-      <w:pPr>
-        <w:pStyle w:val="Heading3"/>
-      </w:pPr>
-      <w:r>
-        <w:t>Validation Rule 1</w:t>
-      </w:r>
-    </w:p>
-    <w:p>
-      <w:r>
-        <w:t>Rule name or what it does:</w:t>
-      </w:r>
-    </w:p>
-    <w:p>
-      <w:r>
-        <w:t xml:space="preserve">&gt; </w:t>
-      </w:r>
-    </w:p>
-    <w:p>
-      <w:r>
-        <w:t>Object it lives on:</w:t>
-      </w:r>
-    </w:p>
-    <w:p>
-      <w:r>
-        <w:t xml:space="preserve">&gt; </w:t>
-      </w:r>
-    </w:p>
-    <w:p>
-      <w:r>
-        <w:t>When it fires (the condition):</w:t>
-      </w:r>
-    </w:p>
-    <w:p>
-      <w:r>
-        <w:t xml:space="preserve">&gt; </w:t>
-      </w:r>
-    </w:p>
-    <w:p>
-      <w:pPr>
-        <w:pStyle w:val="Heading3"/>
-      </w:pPr>
-      <w:r>
-        <w:t>Validation Rule 2</w:t>
-      </w:r>
-    </w:p>
-    <w:p>
-      <w:r>
-        <w:t>Rule name or what it does:</w:t>
-      </w:r>
-    </w:p>
-    <w:p>
-      <w:r>
-        <w:t xml:space="preserve">&gt; </w:t>
-      </w:r>
-    </w:p>
-    <w:p>
-      <w:r>
-        <w:t>Object it lives on:</w:t>
-      </w:r>
-    </w:p>
-    <w:p>
-      <w:r>
-        <w:t xml:space="preserve">&gt; </w:t>
-      </w:r>
-    </w:p>
-    <w:p>
-      <w:r>
-        <w:t>When it fires (the condition):</w:t>
-      </w:r>
-    </w:p>
-    <w:p>
-      <w:r>
-        <w:t xml:space="preserve">&gt; </w:t>
-      </w:r>
-    </w:p>
-    <w:p>
-      <w:pPr>
-        <w:pStyle w:val="Heading3"/>
-      </w:pPr>
-      <w:r>
-        <w:t>Validation Rule 3</w:t>
-      </w:r>
-    </w:p>
-    <w:p>
-      <w:r>
-        <w:t>Rule name or what it does:</w:t>
-      </w:r>
-    </w:p>
-    <w:p>
-      <w:r>
-        <w:t xml:space="preserve">&gt; </w:t>
-      </w:r>
-    </w:p>
-    <w:p>
-      <w:r>
-        <w:t>Object it lives on:</w:t>
-      </w:r>
-    </w:p>
-    <w:p>
-      <w:r>
-        <w:t xml:space="preserve">&gt; </w:t>
-      </w:r>
-    </w:p>
-    <w:p>
-      <w:r>
-        <w:t>When it fires (the condition):</w:t>
-      </w:r>
-    </w:p>
-    <w:p>
-      <w:r>
-        <w:t xml:space="preserve">&gt; </w:t>
-      </w:r>
-    </w:p>
-    <w:p>
-      <w:pPr>
-        <w:pStyle w:val="Heading3"/>
-      </w:pPr>
-      <w:r>
-        <w:t>Validation Rule 4</w:t>
-      </w:r>
-    </w:p>
-    <w:p>
-      <w:r>
-        <w:t>Rule name or what it does:</w:t>
-      </w:r>
-    </w:p>
-    <w:p>
-      <w:r>
-        <w:t xml:space="preserve">&gt; </w:t>
-      </w:r>
-    </w:p>
-    <w:p>
-      <w:r>
-        <w:t>Object it lives on:</w:t>
-      </w:r>
-    </w:p>
-    <w:p>
-      <w:r>
-        <w:t xml:space="preserve">&gt; </w:t>
-      </w:r>
-    </w:p>
-    <w:p>
-      <w:r>
-        <w:t>When it fires (the condition):</w:t>
-      </w:r>
-    </w:p>
-    <w:p>
-      <w:r>
-        <w:t xml:space="preserve">&gt; </w:t>
-      </w:r>
-    </w:p>
-    <w:p>
-      <w:pPr>
-        <w:pStyle w:val="Heading3"/>
-      </w:pPr>
-      <w:r>
-        <w:t>Validation Rule 5</w:t>
-      </w:r>
-    </w:p>
-    <w:p>
-      <w:r>
-        <w:t>Rule name or what it does:</w:t>
-      </w:r>
-    </w:p>
-    <w:p>
-      <w:r>
-        <w:t xml:space="preserve">&gt; </w:t>
-      </w:r>
-    </w:p>
-    <w:p>
-      <w:r>
-        <w:t>Object it lives on:</w:t>
-      </w:r>
-    </w:p>
-    <w:p>
-      <w:r>
-        <w:t xml:space="preserve">&gt; </w:t>
-      </w:r>
-    </w:p>
-    <w:p>
-      <w:r>
-        <w:t>When it fires (the condition):</w:t>
-      </w:r>
-    </w:p>
-    <w:p>
-      <w:r>
-        <w:t xml:space="preserve">&gt; </w:t>
-      </w:r>
-    </w:p>
-    <w:p>
-      <w:pPr>
-        <w:pStyle w:val="Heading1"/>
-      </w:pPr>
-      <w:r>
-        <w:t>Section 6: Reports and Dashboards You Use</w:t>
-      </w:r>
-    </w:p>
-    <w:p>
-      <w:r>
-        <w:t>List the reports and dashboards you use regularly. Group by function (finance, renewals, orders, support, marketing, etc.). Include the report or dashboard name and one sentence on what it shows.</w:t>
-      </w:r>
-    </w:p>
-    <w:p>
-      <w:r>
-        <w:t>Reports you use regularly:</w:t>
-      </w:r>
-    </w:p>
-    <w:p>
-      <w:r>
-        <w:t>1. Report name and what it shows:</w:t>
-      </w:r>
-    </w:p>
-    <w:p>
-      <w:r>
-        <w:t xml:space="preserve">&gt; </w:t>
-      </w:r>
-    </w:p>
-    <w:p>
-      <w:r>
-        <w:t>2. Report name and what it shows:</w:t>
-      </w:r>
-    </w:p>
-    <w:p>
-      <w:r>
-        <w:t xml:space="preserve">&gt; </w:t>
-      </w:r>
-    </w:p>
-    <w:p>
-      <w:r>
-        <w:t>3. Report name and what it shows:</w:t>
-      </w:r>
-    </w:p>
-    <w:p>
-      <w:r>
-        <w:t xml:space="preserve">&gt; </w:t>
-      </w:r>
-    </w:p>
-    <w:p>
-      <w:r>
-        <w:t>4. Report name and what it shows:</w:t>
-      </w:r>
-    </w:p>
-    <w:p>
-      <w:r>
-        <w:t xml:space="preserve">&gt; </w:t>
-      </w:r>
-    </w:p>
-    <w:p>
-      <w:r>
-        <w:t>5. Report name and what it shows:</w:t>
-      </w:r>
-    </w:p>
-    <w:p>
-      <w:r>
-        <w:t xml:space="preserve">&gt; </w:t>
-      </w:r>
-    </w:p>
-    <w:p>
-      <w:r>
-        <w:t>6. Report name and what it shows:</w:t>
-      </w:r>
-    </w:p>
-    <w:p>
-      <w:r>
-        <w:t xml:space="preserve">&gt; </w:t>
-      </w:r>
-    </w:p>
-    <w:p>
-      <w:r>
-        <w:t>7. Report name and what it shows:</w:t>
-      </w:r>
-    </w:p>
-    <w:p>
-      <w:r>
-        <w:t xml:space="preserve">&gt; </w:t>
-      </w:r>
-    </w:p>
-    <w:p>
-      <w:r>
-        <w:t>Dashboards you use regularly:</w:t>
-      </w:r>
-    </w:p>
-    <w:p>
-      <w:r>
-        <w:t>1. Dashboard name and what it shows:</w:t>
-      </w:r>
-    </w:p>
-    <w:p>
-      <w:r>
-        <w:t xml:space="preserve">&gt; </w:t>
-      </w:r>
-    </w:p>
-    <w:p>
-      <w:r>
-        <w:t>2. Dashboard name and what it shows:</w:t>
-      </w:r>
-    </w:p>
-    <w:p>
-      <w:r>
-        <w:t xml:space="preserve">&gt; </w:t>
-      </w:r>
-    </w:p>
-    <w:p>
-      <w:r>
-        <w:t>3. Dashboard name and what it shows:</w:t>
-      </w:r>
-    </w:p>
-    <w:p>
-      <w:r>
-        <w:t xml:space="preserve">&gt; </w:t>
-      </w:r>
-    </w:p>
-    <w:p>
-      <w:r>
-        <w:t>4. Dashboard name and what it shows:</w:t>
-      </w:r>
-    </w:p>
-    <w:p>
-      <w:r>
-        <w:t xml:space="preserve">&gt; </w:t>
-      </w:r>
-    </w:p>
-    <w:p>
-      <w:pPr>
-        <w:pStyle w:val="Heading1"/>
-      </w:pPr>
-      <w:r>
-        <w:t>Section 7: Permission Sets and Profiles</w:t>
-      </w:r>
-    </w:p>
-    <w:p>
-      <w:r>
-        <w:t>List any permission sets you use, manage, or have noticed cause friction (users locked out, surprising access patterns, etc.). Skip if you do not work with permission sets.</w:t>
-      </w:r>
-    </w:p>
-    <w:p>
-      <w:r>
-        <w:t>Permission sets you assign or manage:</w:t>
-      </w:r>
-    </w:p>
-    <w:p>
-      <w:r>
-        <w:t xml:space="preserve">&gt; </w:t>
-      </w:r>
-    </w:p>
-    <w:p>
-      <w:r>
-        <w:t>Profiles in active use at STA (e.g., System Administrator, Standard User, custom profiles):</w:t>
-      </w:r>
-    </w:p>
-    <w:p>
-      <w:r>
-        <w:t xml:space="preserve">&gt; </w:t>
-      </w:r>
-    </w:p>
-    <w:p>
-      <w:r>
-        <w:t>Any non-standard access patterns worth flagging (e.g., 'only Adam and Kelsey have Spanning access', 'Tanya is on a custom profile with extra report folder access'):</w:t>
-      </w:r>
-    </w:p>
-    <w:p>
-      <w:r>
-        <w:t xml:space="preserve">&gt; </w:t>
-      </w:r>
-    </w:p>
-    <w:p>
-      <w:pPr>
-        <w:pStyle w:val="Heading1"/>
-      </w:pPr>
-      <w:r>
-        <w:t>Section 8: Approval Processes</w:t>
-      </w:r>
-    </w:p>
-    <w:p>
-      <w:r>
-        <w:t>Approval processes route records to an approver who must click Approve or Reject before the record moves forward. List any approval processes active at STA - by name or by what they do.</w:t>
-      </w:r>
-    </w:p>
-    <w:p>
-      <w:pPr>
-        <w:pStyle w:val="Heading3"/>
-      </w:pPr>
-      <w:r>
-        <w:t>Approval Process 1</w:t>
-      </w:r>
-    </w:p>
-    <w:p>
-      <w:r>
-        <w:t>Process name or what it approves:</w:t>
-      </w:r>
-    </w:p>
-    <w:p>
-      <w:r>
-        <w:t xml:space="preserve">&gt; </w:t>
-      </w:r>
-    </w:p>
-    <w:p>
-      <w:r>
-        <w:t>Object it lives on:</w:t>
-      </w:r>
-    </w:p>
-    <w:p>
-      <w:r>
-        <w:t xml:space="preserve">&gt; </w:t>
-      </w:r>
-    </w:p>
-    <w:p>
-      <w:r>
-        <w:t>Who is the approver (specific user, role, or queue):</w:t>
-      </w:r>
-    </w:p>
-    <w:p>
-      <w:r>
-        <w:t xml:space="preserve">&gt; </w:t>
-      </w:r>
-    </w:p>
-    <w:p>
-      <w:r>
-        <w:t>When it fires (the trigger condition):</w:t>
-      </w:r>
-    </w:p>
-    <w:p>
-      <w:r>
-        <w:t xml:space="preserve">&gt; </w:t>
-      </w:r>
-    </w:p>
-    <w:p>
-      <w:pPr>
-        <w:pStyle w:val="Heading3"/>
-      </w:pPr>
-      <w:r>
-        <w:t>Approval Process 2</w:t>
-      </w:r>
-    </w:p>
-    <w:p>
-      <w:r>
-        <w:t>Process name or what it approves:</w:t>
-      </w:r>
-    </w:p>
-    <w:p>
-      <w:r>
-        <w:t xml:space="preserve">&gt; </w:t>
-      </w:r>
-    </w:p>
-    <w:p>
-      <w:r>
-        <w:t>Object it lives on:</w:t>
-      </w:r>
-    </w:p>
-    <w:p>
-      <w:r>
-        <w:t xml:space="preserve">&gt; </w:t>
-      </w:r>
-    </w:p>
-    <w:p>
-      <w:r>
-        <w:t>Who is the approver (specific user, role, or queue):</w:t>
-      </w:r>
-    </w:p>
-    <w:p>
-      <w:r>
-        <w:t xml:space="preserve">&gt; </w:t>
-      </w:r>
-    </w:p>
-    <w:p>
-      <w:r>
-        <w:t>When it fires (the trigger condition):</w:t>
-      </w:r>
-    </w:p>
-    <w:p>
-      <w:r>
-        <w:t xml:space="preserve">&gt; </w:t>
-      </w:r>
-    </w:p>
-    <w:p>
-      <w:pPr>
-        <w:pStyle w:val="Heading3"/>
-      </w:pPr>
-      <w:r>
-        <w:t>Approval Process 3</w:t>
-      </w:r>
-    </w:p>
-    <w:p>
-      <w:r>
-        <w:t>Process name or what it approves:</w:t>
-      </w:r>
-    </w:p>
-    <w:p>
-      <w:r>
-        <w:t xml:space="preserve">&gt; </w:t>
-      </w:r>
-    </w:p>
-    <w:p>
-      <w:r>
-        <w:t>Object it lives on:</w:t>
-      </w:r>
-    </w:p>
-    <w:p>
-      <w:r>
-        <w:t xml:space="preserve">&gt; </w:t>
-      </w:r>
-    </w:p>
-    <w:p>
-      <w:r>
-        <w:t>Who is the approver (specific user, role, or queue):</w:t>
-      </w:r>
-    </w:p>
-    <w:p>
-      <w:r>
-        <w:t xml:space="preserve">&gt; </w:t>
-      </w:r>
-    </w:p>
-    <w:p>
-      <w:r>
-        <w:t>When it fires (the trigger condition):</w:t>
-      </w:r>
-    </w:p>
-    <w:p>
-      <w:r>
-        <w:t xml:space="preserve">&gt; </w:t>
-      </w:r>
-    </w:p>
-    <w:p>
-      <w:pPr>
-        <w:pStyle w:val="Heading3"/>
-      </w:pPr>
-      <w:r>
-        <w:t>Approval Process 4</w:t>
-      </w:r>
-    </w:p>
-    <w:p>
-      <w:r>
-        <w:t>Process name or what it approves:</w:t>
-      </w:r>
-    </w:p>
-    <w:p>
-      <w:r>
-        <w:t xml:space="preserve">&gt; </w:t>
-      </w:r>
-    </w:p>
-    <w:p>
-      <w:r>
-        <w:t>Object it lives on:</w:t>
-      </w:r>
-    </w:p>
-    <w:p>
-      <w:r>
-        <w:t xml:space="preserve">&gt; </w:t>
-      </w:r>
-    </w:p>
-    <w:p>
-      <w:r>
-        <w:t>Who is the approver (specific user, role, or queue):</w:t>
-      </w:r>
-    </w:p>
-    <w:p>
-      <w:r>
-        <w:t xml:space="preserve">&gt; </w:t>
-      </w:r>
-    </w:p>
-    <w:p>
-      <w:r>
-        <w:t>When it fires (the trigger condition):</w:t>
-      </w:r>
-    </w:p>
-    <w:p>
-      <w:r>
-        <w:t xml:space="preserve">&gt; </w:t>
-      </w:r>
-    </w:p>
-    <w:p>
-      <w:pPr>
-        <w:pStyle w:val="Heading1"/>
-      </w:pPr>
-      <w:r>
-        <w:t>Section 9: CPQ Configuration (Joanie + Adam mainly)</w:t>
-      </w:r>
-    </w:p>
-    <w:p>
-      <w:r>
-        <w:t>Salesforce CPQ handles product configuration, pricing rules, quotes, and approvals on the sales side. Fill out what you know; skip if you do not work with CPQ.</w:t>
-      </w:r>
-    </w:p>
-    <w:p>
-      <w:r>
-        <w:t>Products in the CPQ catalog you work with most often:</w:t>
-      </w:r>
-    </w:p>
-    <w:p>
-      <w:r>
-        <w:t xml:space="preserve">&gt; </w:t>
-      </w:r>
-    </w:p>
-    <w:p>
-      <w:r>
-        <w:t>Price books in active use (e.g., 'Standard', 'WSIPC', 'Discounted'):</w:t>
-      </w:r>
-    </w:p>
-    <w:p>
-      <w:r>
-        <w:t xml:space="preserve">&gt; </w:t>
-      </w:r>
-    </w:p>
-    <w:p>
-      <w:r>
-        <w:t>Discount schedules in active use:</w:t>
-      </w:r>
-    </w:p>
-    <w:p>
-      <w:r>
-        <w:t xml:space="preserve">&gt; </w:t>
-      </w:r>
-    </w:p>
-    <w:p>
-      <w:r>
-        <w:t>Quote template(s) you use:</w:t>
-      </w:r>
-    </w:p>
-    <w:p>
-      <w:r>
-        <w:t xml:space="preserve">&gt; </w:t>
-      </w:r>
-    </w:p>
-    <w:p>
-      <w:r>
-        <w:t>Approval rules tied to CPQ (e.g., discount-over-X requires manager approval):</w:t>
-      </w:r>
-    </w:p>
-    <w:p>
-      <w:r>
-        <w:t xml:space="preserve">&gt; </w:t>
-      </w:r>
-    </w:p>
-    <w:p>
-      <w:r>
-        <w:t>Document templates for generated quotes/proposals:</w:t>
-      </w:r>
-    </w:p>
-    <w:p>
-      <w:r>
-        <w:t xml:space="preserve">&gt; </w:t>
-      </w:r>
-    </w:p>
-    <w:p>
-      <w:pPr>
-        <w:pStyle w:val="Heading1"/>
-      </w:pPr>
-      <w:r>
-        <w:t>Section 10: Spanning Backup</w:t>
-      </w:r>
-    </w:p>
-    <w:p>
-      <w:r>
-        <w:t>Spanning is the backup product for Salesforce data and metadata. Most cohort members will not have Spanning access; that is fine. Fill out only what applies.</w:t>
-      </w:r>
-    </w:p>
-    <w:p>
-      <w:r>
-        <w:t>Do you have Spanning access?</w:t>
-      </w:r>
-    </w:p>
-    <w:p>
-      <w:r>
-        <w:t xml:space="preserve">&gt; </w:t>
-      </w:r>
-    </w:p>
-    <w:p>
-      <w:r>
-        <w:t>If yes, what does the backup schedule look like (daily, hourly, etc.)?</w:t>
-      </w:r>
-    </w:p>
-    <w:p>
-      <w:r>
-        <w:t xml:space="preserve">&gt; </w:t>
-      </w:r>
-    </w:p>
-    <w:p>
-      <w:r>
-        <w:t>Have you ever needed to restore from Spanning? Briefly describe what happened and how it went:</w:t>
-      </w:r>
-    </w:p>
-    <w:p>
-      <w:r>
-        <w:t xml:space="preserve">&gt; </w:t>
-      </w:r>
-    </w:p>
-    <w:p>
-      <w:pPr>
-        <w:pStyle w:val="Heading1"/>
-      </w:pPr>
-      <w:r>
-        <w:t>Section 11: Integrations</w:t>
-      </w:r>
-    </w:p>
-    <w:p>
-      <w:r>
-        <w:t>STA's Salesforce integrates with several other systems. List which integrations touch your work and what they sync. Examples: Skyward, WooCommerce, Stripe, Mailchimp, eFunds, custom APIs.</w:t>
-      </w:r>
-    </w:p>
-    <w:p>
-      <w:pPr>
-        <w:pStyle w:val="Heading3"/>
-      </w:pPr>
-      <w:r>
-        <w:t>Integration 1</w:t>
-      </w:r>
-    </w:p>
-    <w:p>
-      <w:r>
-        <w:t>System name:</w:t>
-      </w:r>
-    </w:p>
-    <w:p>
-      <w:r>
-        <w:t xml:space="preserve">&gt; </w:t>
-      </w:r>
-    </w:p>
-    <w:p>
-      <w:r>
-        <w:t>What data flows in or out of Salesforce:</w:t>
-      </w:r>
-    </w:p>
-    <w:p>
-      <w:r>
-        <w:t xml:space="preserve">&gt; </w:t>
-      </w:r>
-    </w:p>
-    <w:p>
-      <w:r>
-        <w:t>How often (real-time, nightly, on-demand):</w:t>
-      </w:r>
-    </w:p>
-    <w:p>
-      <w:r>
-        <w:t xml:space="preserve">&gt; </w:t>
-      </w:r>
-    </w:p>
-    <w:p>
-      <w:pPr>
-        <w:pStyle w:val="Heading3"/>
-      </w:pPr>
-      <w:r>
-        <w:t>Integration 2</w:t>
-      </w:r>
-    </w:p>
-    <w:p>
-      <w:r>
-        <w:t>System name:</w:t>
-      </w:r>
-    </w:p>
-    <w:p>
-      <w:r>
-        <w:t xml:space="preserve">&gt; </w:t>
-      </w:r>
-    </w:p>
-    <w:p>
-      <w:r>
-        <w:t>What data flows in or out of Salesforce:</w:t>
-      </w:r>
-    </w:p>
-    <w:p>
-      <w:r>
-        <w:t xml:space="preserve">&gt; </w:t>
-      </w:r>
-    </w:p>
-    <w:p>
-      <w:r>
-        <w:t>How often (real-time, nightly, on-demand):</w:t>
-      </w:r>
-    </w:p>
-    <w:p>
-      <w:r>
-        <w:t xml:space="preserve">&gt; </w:t>
-      </w:r>
-    </w:p>
-    <w:p>
-      <w:pPr>
-        <w:pStyle w:val="Heading3"/>
-      </w:pPr>
-      <w:r>
-        <w:t>Integration 3</w:t>
-      </w:r>
-    </w:p>
-    <w:p>
-      <w:r>
-        <w:t>System name:</w:t>
-      </w:r>
-    </w:p>
-    <w:p>
-      <w:r>
-        <w:t xml:space="preserve">&gt; </w:t>
-      </w:r>
-    </w:p>
-    <w:p>
-      <w:r>
-        <w:t>What data flows in or out of Salesforce:</w:t>
-      </w:r>
-    </w:p>
-    <w:p>
-      <w:r>
-        <w:t xml:space="preserve">&gt; </w:t>
-      </w:r>
-    </w:p>
-    <w:p>
-      <w:r>
-        <w:t>How often (real-time, nightly, on-demand):</w:t>
-      </w:r>
-    </w:p>
-    <w:p>
-      <w:r>
-        <w:t xml:space="preserve">&gt; </w:t>
-      </w:r>
-    </w:p>
-    <w:p>
-      <w:pPr>
-        <w:pStyle w:val="Heading3"/>
-      </w:pPr>
-      <w:r>
-        <w:t>Integration 4</w:t>
-      </w:r>
-    </w:p>
-    <w:p>
-      <w:r>
-        <w:t>System name:</w:t>
-      </w:r>
-    </w:p>
-    <w:p>
-      <w:r>
-        <w:t xml:space="preserve">&gt; </w:t>
-      </w:r>
-    </w:p>
-    <w:p>
-      <w:r>
-        <w:t>What data flows in or out of Salesforce:</w:t>
-      </w:r>
-    </w:p>
-    <w:p>
-      <w:r>
-        <w:t xml:space="preserve">&gt; </w:t>
-      </w:r>
-    </w:p>
-    <w:p>
-      <w:r>
-        <w:t>How often (real-time, nightly, on-demand):</w:t>
-      </w:r>
-    </w:p>
-    <w:p>
-      <w:r>
-        <w:t xml:space="preserve">&gt; </w:t>
-      </w:r>
-    </w:p>
-    <w:p>
-      <w:pPr>
-        <w:pStyle w:val="Heading3"/>
-      </w:pPr>
-      <w:r>
-        <w:t>Integration 5</w:t>
-      </w:r>
-    </w:p>
-    <w:p>
-      <w:r>
-        <w:t>System name:</w:t>
-      </w:r>
-    </w:p>
-    <w:p>
-      <w:r>
-        <w:t xml:space="preserve">&gt; </w:t>
-      </w:r>
-    </w:p>
-    <w:p>
-      <w:r>
-        <w:t>What data flows in or out of Salesforce:</w:t>
-      </w:r>
-    </w:p>
-    <w:p>
-      <w:r>
-        <w:t xml:space="preserve">&gt; </w:t>
-      </w:r>
-    </w:p>
-    <w:p>
-      <w:r>
-        <w:t>How often (real-time, nightly, on-demand):</w:t>
-      </w:r>
-    </w:p>
-    <w:p>
-      <w:r>
-        <w:t xml:space="preserve">&gt; </w:t>
-      </w:r>
-    </w:p>
-    <w:p>
-      <w:pPr>
-        <w:pStyle w:val="Heading1"/>
-      </w:pPr>
-      <w:r>
-        <w:t>Section 12: Email Templates and Letterheads</w:t>
-      </w:r>
-    </w:p>
-    <w:p>
-      <w:r>
-        <w:t>List any email templates or letterheads in Salesforce that you use to send customer communications - quote follow-ups, renewal notices, support replies, marketing emails, etc.</w:t>
-      </w:r>
-    </w:p>
-    <w:p>
-      <w:r>
-        <w:t>Templates you use regularly:</w:t>
-      </w:r>
-    </w:p>
-    <w:p>
-      <w:r>
-        <w:t xml:space="preserve">&gt; </w:t>
-      </w:r>
-    </w:p>
-    <w:p>
-      <w:r>
-        <w:t>Letterhead(s) currently active:</w:t>
-      </w:r>
-    </w:p>
-    <w:p>
-      <w:r>
-        <w:t xml:space="preserve">&gt; </w:t>
-      </w:r>
-    </w:p>
-    <w:p>
-      <w:pPr>
-        <w:pStyle w:val="Heading1"/>
-      </w:pPr>
-      <w:r>
-        <w:t>Section 13: Salesforce-Specific Friction Points</w:t>
-      </w:r>
-    </w:p>
-    <w:p>
-      <w:r>
-        <w:t>Anything Salesforce-specific the cohort assistant should know? This section deliberately scopes to Salesforce structural quirks, not general work pain points (those live in the Department AI Workflow Planner).</w:t>
-      </w:r>
-    </w:p>
-    <w:p>
-      <w:r>
-        <w:t>Things in the Salesforce org that are non-obvious or counter-intuitive (e.g., 'we use the standard Lead Source field for something other than lead source', 'the Opportunity object stores renewals via a custom record type'):</w:t>
-      </w:r>
-    </w:p>
-    <w:p>
-      <w:r>
-        <w:t xml:space="preserve">&gt; </w:t>
-      </w:r>
-    </w:p>
-    <w:p>
-      <w:r>
-        <w:t>Salesforce automations that have edge-case behavior you have to remember (e.g., 'this validation rule fires on every save not just create'):</w:t>
-      </w:r>
-    </w:p>
-    <w:p>
-      <w:r>
-        <w:t xml:space="preserve">&gt; </w:t>
-      </w:r>
-    </w:p>
-    <w:p>
-      <w:r>
-        <w:t>Salesforce features or packages we have but you wish were configured differently:</w:t>
-      </w:r>
-    </w:p>
-    <w:p>
-      <w:r>
-        <w:t xml:space="preserve">&gt; </w:t>
-      </w:r>
-    </w:p>
-    <w:p>
-      <w:r>
-        <w:t>Anything else Salesforce-structural:</w:t>
-      </w:r>
-    </w:p>
-    <w:p>
-      <w:r>
-        <w:t xml:space="preserve">&gt; </w:t>
-      </w:r>
-    </w:p>
-    <w:p>
-      <w:pPr>
-        <w:spacing w:before="360"/>
-      </w:pPr>
-      <w:r>
-        <w:rPr>
-          <w:i/>
-          <w:color w:val="5A5F72"/>
-          <w:sz w:val="20"/>
-        </w:rPr>
-        <w:t>Return this file to Adam when complete. Filled answers feed v1.1 of the cohort assistant's STA Salesforce org context file. Broader workflow questions live in the separate Department AI Workflow Planner.</w:t>
+        <w:t>&gt;</w:t>
       </w:r>
     </w:p>
     <w:sectPr>
@@ -2299,7 +562,7 @@
     <w:qFormat/>
     <w:rsid w:val="00FC693F"/>
     <w:pPr>
-      <w:spacing w:after="120" w:line="300" w:lineRule="auto"/>
+      <w:spacing w:line="300" w:lineRule="auto" w:after="120"/>
     </w:pPr>
     <w:rPr>
       <w:rFonts w:ascii="Calibri" w:hAnsi="Calibri"/>
@@ -2365,10 +628,10 @@
       <w:outlineLvl w:val="0"/>
     </w:pPr>
     <w:rPr>
-      <w:rFonts w:asciiTheme="majorHAnsi" w:eastAsiaTheme="majorEastAsia" w:hAnsiTheme="majorHAnsi" w:cstheme="majorBidi"/>
+      <w:rFonts w:asciiTheme="majorHAnsi" w:eastAsiaTheme="majorEastAsia" w:hAnsiTheme="majorHAnsi" w:cstheme="majorBidi" w:ascii="Calibri" w:hAnsi="Calibri"/>
       <w:b/>
       <w:bCs/>
-      <w:color w:val="006098"/>
+      <w:color w:val="1F3A5F"/>
       <w:sz w:val="36"/>
       <w:szCs w:val="28"/>
     </w:rPr>
@@ -2389,10 +652,10 @@
       <w:outlineLvl w:val="1"/>
     </w:pPr>
     <w:rPr>
-      <w:rFonts w:asciiTheme="majorHAnsi" w:eastAsiaTheme="majorEastAsia" w:hAnsiTheme="majorHAnsi" w:cstheme="majorBidi"/>
+      <w:rFonts w:asciiTheme="majorHAnsi" w:eastAsiaTheme="majorEastAsia" w:hAnsiTheme="majorHAnsi" w:cstheme="majorBidi" w:ascii="Calibri" w:hAnsi="Calibri"/>
       <w:b/>
       <w:bCs/>
-      <w:color w:val="006098"/>
+      <w:color w:val="1F3A5F"/>
       <w:sz w:val="28"/>
       <w:szCs w:val="26"/>
     </w:rPr>
@@ -2409,15 +672,14 @@
     <w:pPr>
       <w:keepNext/>
       <w:keepLines/>
-      <w:spacing w:before="160" w:after="80"/>
+      <w:spacing w:before="200" w:after="0"/>
       <w:outlineLvl w:val="2"/>
     </w:pPr>
     <w:rPr>
       <w:rFonts w:asciiTheme="majorHAnsi" w:eastAsiaTheme="majorEastAsia" w:hAnsiTheme="majorHAnsi" w:cstheme="majorBidi"/>
       <w:b/>
       <w:bCs/>
-      <w:color w:val="1A1A2E"/>
-      <w:sz w:val="24"/>
+      <w:color w:val="4F81BD" w:themeColor="accent1"/>
     </w:rPr>
   </w:style>
   <w:style w:type="paragraph" w:styleId="Heading4">

</xml_diff>

<commit_message>
Hub batch 3: remove onboarding-deck from AI Admin (kept in Start Here); delete Ship Readiness Brief; collapse Rollout planning section, move AI Rollout Plan into Build pipeline, leave System reference at top; center text in Helpful Links cards; replace SF Org Intake docx with v2; add Download button to docx viewer cards
Co-Authored-By: Claude Opus 4.7 (1M context) <noreply@anthropic.com>
</commit_message>
<xml_diff>
--- a/dist/files/sta-salesforce-org-intake.docx
+++ b/dist/files/sta-salesforce-org-intake.docx
@@ -9,22 +9,23 @@
       <w:r>
         <w:rPr>
           <w:b/>
-          <w:color w:val="1F3A5F"/>
+          <w:color w:val="006098"/>
           <w:sz w:val="44"/>
         </w:rPr>
-        <w:t>School Tech Salesforce Cohort - Org Intake</w:t>
+        <w:t>STA Salesforce Org Intake</w:t>
       </w:r>
     </w:p>
     <w:p>
       <w:pPr>
-        <w:spacing w:after="280"/>
+        <w:spacing w:after="360"/>
       </w:pPr>
       <w:r>
         <w:rPr>
           <w:i/>
-          <w:color w:val="555555"/>
+          <w:color w:val="5A5F72"/>
+          <w:sz w:val="22"/>
         </w:rPr>
-        <w:t>Captures how you actually use Salesforce - your workflows, pain points, and where AI could help.</w:t>
+        <w:t>For the STA Salesforce Cohort Claude.ai Project (v2.0) - updated 2026-05-22 from org metadata export</w:t>
       </w:r>
     </w:p>
     <w:p>
@@ -37,17 +38,17 @@
     </w:p>
     <w:p>
       <w:r>
-        <w:t>This intake captures how you actually use Salesforce - the workflows, decisions, and pain points that make up your day. The goal is to give the School Tech Salesforce Cohort AI assistant enough context to be useful from day one. Adam will pair these answers with org metadata exported separately, so you do not need to dig into API names, custom object lists, or technical configuration.</w:t>
+        <w:t>Fill out the sections below to give the STA Salesforce Cohort assistant the org-specific Salesforce configuration it needs. This intake is intentionally narrow - it catches Salesforce-specific structural details only. Broader workflow, decision-making, and tool questions are covered in the separate Department AI Workflow Planner; this doc deliberately avoids duplicating those questions. If you have not yet filled out the Department AI Workflow Planner, that one is also useful but not required first - either can be completed in either order.</w:t>
       </w:r>
     </w:p>
     <w:p>
       <w:r>
-        <w:t>Answer in plain prose. Skip anything that does not apply to you. Concrete and honest beats thorough and polished. About 10 minutes total.</w:t>
+        <w:t>Answer what you can; mark anything you do not know with 'not sure' and Adam will follow up. Concrete and honest beats thorough and polished. If a section does not apply to your work in Salesforce, write 'N/A.' Expected time: 15 minutes per person.</w:t>
       </w:r>
     </w:p>
     <w:p>
       <w:r>
-        <w:t>When you are done, share the document back with Adam.</w:t>
+        <w:t>When you are done, return this file to Adam. He will package the answers into context-sta-salesforce-org.md v1.1 and re-upload the updated context file to the Project.</w:t>
       </w:r>
     </w:p>
     <w:p>
@@ -55,49 +56,85 @@
         <w:pStyle w:val="Heading1"/>
       </w:pPr>
       <w:r>
-        <w:t>Section 1: Your Salesforce world</w:t>
+        <w:t>Section 1: Your Salesforce Access</w:t>
       </w:r>
     </w:p>
     <w:p>
       <w:r>
-        <w:t>Briefly describe your role and how Salesforce fits into it. Cover:</w:t>
+        <w:t>Your name:</w:t>
       </w:r>
     </w:p>
     <w:p>
-      <w:pPr>
-        <w:pStyle w:val="ListBullet"/>
-      </w:pPr>
       <w:r>
-        <w:t>Your name and your role at School Tech</w:t>
+        <w:t xml:space="preserve">&gt; </w:t>
       </w:r>
     </w:p>
     <w:p>
-      <w:pPr>
-        <w:pStyle w:val="ListBullet"/>
-      </w:pPr>
       <w:r>
-        <w:t>Which Salesforce environments you log into regularly (production, any sandboxes you use)</w:t>
+        <w:t>Which orgs do you have access to (Production, Developer Sandbox, Partial Data Sandbox)? List any access constraints:</w:t>
       </w:r>
     </w:p>
     <w:p>
-      <w:pPr>
-        <w:pStyle w:val="ListBullet"/>
-      </w:pPr>
       <w:r>
-        <w:t>Any non-vanilla Salesforce tools you rely on - CPQ, Spanning Backup, AppExchange packages, integrations with other systems</w:t>
+        <w:t xml:space="preserve">&gt; </w:t>
+      </w:r>
+    </w:p>
+    <w:p>
+      <w:r>
+        <w:t>Which product lines are most relevant to your work? (Circle or mark all that apply: TRAK / Time Clocks / ID Badging / Visitor Management / Positive Attendance / Food Service / Tardy Kiosk / Skyward)</w:t>
+      </w:r>
+    </w:p>
+    <w:p>
+      <w:r>
+        <w:t xml:space="preserve">&gt; </w:t>
+      </w:r>
+    </w:p>
+    <w:p>
+      <w:r>
+        <w:t>Which of the following packages do you regularly use? Mark each with X (use = active), A (access but not active), or leave blank (no access):</w:t>
+      </w:r>
+    </w:p>
+    <w:p>
+      <w:r>
+        <w:t xml:space="preserve">[ ] Salesforce CPQ</w:t>
+      </w:r>
+    </w:p>
+    <w:p>
+      <w:r>
+        <w:t xml:space="preserve">[ ] Accounting Seed Financial Suite</w:t>
+      </w:r>
+    </w:p>
+    <w:p>
+      <w:r>
+        <w:t xml:space="preserve">[ ] Accounting Seed Orders &amp; Inventory</w:t>
+      </w:r>
+    </w:p>
+    <w:p>
+      <w:r>
+        <w:t xml:space="preserve">[ ] DBSync QuickBooks Integration</w:t>
+      </w:r>
+    </w:p>
+    <w:p>
+      <w:r>
+        <w:t xml:space="preserve">[ ] Salesforce DevOps Center</w:t>
+      </w:r>
+    </w:p>
+    <w:p>
+      <w:r>
+        <w:t xml:space="preserve">[ ] Spanning Backup</w:t>
+      </w:r>
+    </w:p>
+    <w:p>
+      <w:r>
+        <w:t xml:space="preserve">[ ] Autofy</w:t>
       </w:r>
     </w:p>
     <w:p>
       <w:r>
         <w:rPr>
-          <w:b/>
+          <w:i/>
         </w:rPr>
-        <w:t>Your answer:</w:t>
-      </w:r>
-    </w:p>
-    <w:p>
-      <w:r>
-        <w:t>&gt;</w:t>
+        <w:t>Note: 'What you primarily do in your day-to-day work' is covered in the Department AI Workflow Planner Section 2 (most common tasks) - not duplicated here.</w:t>
       </w:r>
     </w:p>
     <w:p>
@@ -105,30 +142,25 @@
         <w:pStyle w:val="Heading1"/>
       </w:pPr>
       <w:r>
-        <w:t>Section 2: What you actually do in Salesforce</w:t>
-      </w:r>
-    </w:p>
-    <w:p>
-      <w:r>
-        <w:t>In 3 to 5 sentences, describe what your Salesforce work looks like on a normal week. Write it the way you would describe it to a coworker - reports you run, records you update, screens you live in, what changes at month-end or quarter-end if anything.</w:t>
-      </w:r>
-    </w:p>
-    <w:p>
-      <w:r>
-        <w:t>No technical detail needed. If you spend most of your Salesforce time on one or two specific tasks, say so - that focus is useful.</w:t>
+        <w:t>Section 2: Custom Objects</w:t>
       </w:r>
     </w:p>
     <w:p>
       <w:r>
         <w:rPr>
-          <w:b/>
+          <w:i/>
         </w:rPr>
-        <w:t>Your answer:</w:t>
+        <w:t>Note: The only STA-built custom object is Building Information (Building_Information__c), which Adam built. All other custom objects in the org belong to managed packages (CPQ, Accounting Seed, DevOps Center, etc.).</w:t>
       </w:r>
     </w:p>
     <w:p>
       <w:r>
-        <w:t>&gt;</w:t>
+        <w:t>Are there any custom objects in your area of work that you don’t think Adam built? If so, name them:</w:t>
+      </w:r>
+    </w:p>
+    <w:p>
+      <w:r>
+        <w:t xml:space="preserve">&gt; </w:t>
       </w:r>
     </w:p>
     <w:p>
@@ -136,30 +168,321 @@
         <w:pStyle w:val="Heading1"/>
       </w:pPr>
       <w:r>
-        <w:t>Section 3: Custom stuff that matters to you</w:t>
+        <w:t>Section 3: Custom Fields You Rely On</w:t>
       </w:r>
     </w:p>
     <w:p>
       <w:r>
-        <w:t>Tell me about any custom objects, fields, flows, automations, or validation rules that you bump into regularly. Use whatever names you call them - formal or informal, doesn't matter. Do not worry about API names or technical exactness.</w:t>
+        <w:t>List the custom fields you reference most often in your work - on any object. For each, give the field label, the object it lives on, and what it stores. Focus on fields you use in reports, filters, or validation rules, not every custom field that exists.</w:t>
       </w:r>
     </w:p>
     <w:p>
       <w:r>
-        <w:t>If something has ever blocked you, surprised you, or saved you significant time, flag it. If you have built a workaround - a manual process to compensate for a missing feature, or maintain a separate spreadsheet because something is hard to do in Salesforce - that is especially useful to know.</w:t>
+        <w:t>Example: Field label: Renewal Date. Object: Account. What it stores: The date the customer's contract is up for renewal; used in renewal pipeline reports.</w:t>
+      </w:r>
+    </w:p>
+    <w:p>
+      <w:pPr>
+        <w:pStyle w:val="Heading3"/>
+      </w:pPr>
+      <w:r>
+        <w:t>Field 1</w:t>
       </w:r>
     </w:p>
     <w:p>
       <w:r>
-        <w:rPr>
-          <w:b/>
-        </w:rPr>
-        <w:t>Your answer:</w:t>
+        <w:t>Field label:</w:t>
       </w:r>
     </w:p>
     <w:p>
       <w:r>
-        <w:t>&gt;</w:t>
+        <w:t xml:space="preserve">&gt; </w:t>
+      </w:r>
+    </w:p>
+    <w:p>
+      <w:r>
+        <w:t>Object it lives on:</w:t>
+      </w:r>
+    </w:p>
+    <w:p>
+      <w:r>
+        <w:t xml:space="preserve">&gt; </w:t>
+      </w:r>
+    </w:p>
+    <w:p>
+      <w:r>
+        <w:t>What it stores and where you use it:</w:t>
+      </w:r>
+    </w:p>
+    <w:p>
+      <w:r>
+        <w:t xml:space="preserve">&gt; </w:t>
+      </w:r>
+    </w:p>
+    <w:p>
+      <w:pPr>
+        <w:pStyle w:val="Heading3"/>
+      </w:pPr>
+      <w:r>
+        <w:t>Field 2</w:t>
+      </w:r>
+    </w:p>
+    <w:p>
+      <w:r>
+        <w:t>Field label:</w:t>
+      </w:r>
+    </w:p>
+    <w:p>
+      <w:r>
+        <w:t xml:space="preserve">&gt; </w:t>
+      </w:r>
+    </w:p>
+    <w:p>
+      <w:r>
+        <w:t>Object it lives on:</w:t>
+      </w:r>
+    </w:p>
+    <w:p>
+      <w:r>
+        <w:t xml:space="preserve">&gt; </w:t>
+      </w:r>
+    </w:p>
+    <w:p>
+      <w:r>
+        <w:t>What it stores and where you use it:</w:t>
+      </w:r>
+    </w:p>
+    <w:p>
+      <w:r>
+        <w:t xml:space="preserve">&gt; </w:t>
+      </w:r>
+    </w:p>
+    <w:p>
+      <w:pPr>
+        <w:pStyle w:val="Heading3"/>
+      </w:pPr>
+      <w:r>
+        <w:t>Field 3</w:t>
+      </w:r>
+    </w:p>
+    <w:p>
+      <w:r>
+        <w:t>Field label:</w:t>
+      </w:r>
+    </w:p>
+    <w:p>
+      <w:r>
+        <w:t xml:space="preserve">&gt; </w:t>
+      </w:r>
+    </w:p>
+    <w:p>
+      <w:r>
+        <w:t>Object it lives on:</w:t>
+      </w:r>
+    </w:p>
+    <w:p>
+      <w:r>
+        <w:t xml:space="preserve">&gt; </w:t>
+      </w:r>
+    </w:p>
+    <w:p>
+      <w:r>
+        <w:t>What it stores and where you use it:</w:t>
+      </w:r>
+    </w:p>
+    <w:p>
+      <w:r>
+        <w:t xml:space="preserve">&gt; </w:t>
+      </w:r>
+    </w:p>
+    <w:p>
+      <w:pPr>
+        <w:pStyle w:val="Heading3"/>
+      </w:pPr>
+      <w:r>
+        <w:t>Field 4</w:t>
+      </w:r>
+    </w:p>
+    <w:p>
+      <w:r>
+        <w:t>Field label:</w:t>
+      </w:r>
+    </w:p>
+    <w:p>
+      <w:r>
+        <w:t xml:space="preserve">&gt; </w:t>
+      </w:r>
+    </w:p>
+    <w:p>
+      <w:r>
+        <w:t>Object it lives on:</w:t>
+      </w:r>
+    </w:p>
+    <w:p>
+      <w:r>
+        <w:t xml:space="preserve">&gt; </w:t>
+      </w:r>
+    </w:p>
+    <w:p>
+      <w:r>
+        <w:t>What it stores and where you use it:</w:t>
+      </w:r>
+    </w:p>
+    <w:p>
+      <w:r>
+        <w:t xml:space="preserve">&gt; </w:t>
+      </w:r>
+    </w:p>
+    <w:p>
+      <w:pPr>
+        <w:pStyle w:val="Heading3"/>
+      </w:pPr>
+      <w:r>
+        <w:t>Field 5</w:t>
+      </w:r>
+    </w:p>
+    <w:p>
+      <w:r>
+        <w:t>Field label:</w:t>
+      </w:r>
+    </w:p>
+    <w:p>
+      <w:r>
+        <w:t xml:space="preserve">&gt; </w:t>
+      </w:r>
+    </w:p>
+    <w:p>
+      <w:r>
+        <w:t>Object it lives on:</w:t>
+      </w:r>
+    </w:p>
+    <w:p>
+      <w:r>
+        <w:t xml:space="preserve">&gt; </w:t>
+      </w:r>
+    </w:p>
+    <w:p>
+      <w:r>
+        <w:t>What it stores and where you use it:</w:t>
+      </w:r>
+    </w:p>
+    <w:p>
+      <w:r>
+        <w:t xml:space="preserve">&gt; </w:t>
+      </w:r>
+    </w:p>
+    <w:p>
+      <w:pPr>
+        <w:pStyle w:val="Heading3"/>
+      </w:pPr>
+      <w:r>
+        <w:t>Field 6</w:t>
+      </w:r>
+    </w:p>
+    <w:p>
+      <w:r>
+        <w:t>Field label:</w:t>
+      </w:r>
+    </w:p>
+    <w:p>
+      <w:r>
+        <w:t xml:space="preserve">&gt; </w:t>
+      </w:r>
+    </w:p>
+    <w:p>
+      <w:r>
+        <w:t>Object it lives on:</w:t>
+      </w:r>
+    </w:p>
+    <w:p>
+      <w:r>
+        <w:t xml:space="preserve">&gt; </w:t>
+      </w:r>
+    </w:p>
+    <w:p>
+      <w:r>
+        <w:t>What it stores and where you use it:</w:t>
+      </w:r>
+    </w:p>
+    <w:p>
+      <w:r>
+        <w:t xml:space="preserve">&gt; </w:t>
+      </w:r>
+    </w:p>
+    <w:p>
+      <w:pPr>
+        <w:pStyle w:val="Heading3"/>
+      </w:pPr>
+      <w:r>
+        <w:t>Field 7</w:t>
+      </w:r>
+    </w:p>
+    <w:p>
+      <w:r>
+        <w:t>Field label:</w:t>
+      </w:r>
+    </w:p>
+    <w:p>
+      <w:r>
+        <w:t xml:space="preserve">&gt; </w:t>
+      </w:r>
+    </w:p>
+    <w:p>
+      <w:r>
+        <w:t>Object it lives on:</w:t>
+      </w:r>
+    </w:p>
+    <w:p>
+      <w:r>
+        <w:t xml:space="preserve">&gt; </w:t>
+      </w:r>
+    </w:p>
+    <w:p>
+      <w:r>
+        <w:t>What it stores and where you use it:</w:t>
+      </w:r>
+    </w:p>
+    <w:p>
+      <w:r>
+        <w:t xml:space="preserve">&gt; </w:t>
+      </w:r>
+    </w:p>
+    <w:p>
+      <w:pPr>
+        <w:pStyle w:val="Heading3"/>
+      </w:pPr>
+      <w:r>
+        <w:t>Field 8</w:t>
+      </w:r>
+    </w:p>
+    <w:p>
+      <w:r>
+        <w:t>Field label:</w:t>
+      </w:r>
+    </w:p>
+    <w:p>
+      <w:r>
+        <w:t xml:space="preserve">&gt; </w:t>
+      </w:r>
+    </w:p>
+    <w:p>
+      <w:r>
+        <w:t>Object it lives on:</w:t>
+      </w:r>
+    </w:p>
+    <w:p>
+      <w:r>
+        <w:t xml:space="preserve">&gt; </w:t>
+      </w:r>
+    </w:p>
+    <w:p>
+      <w:r>
+        <w:t>What it stores and where you use it:</w:t>
+      </w:r>
+    </w:p>
+    <w:p>
+      <w:r>
+        <w:t xml:space="preserve">&gt; </w:t>
       </w:r>
     </w:p>
     <w:p>
@@ -167,25 +490,850 @@
         <w:pStyle w:val="Heading1"/>
       </w:pPr>
       <w:r>
-        <w:t>Section 4: Where you want AI help first</w:t>
-      </w:r>
-    </w:p>
-    <w:p>
-      <w:r>
-        <w:t>If the School Tech Salesforce Cohort assistant could help you with anything in your Salesforce work, what would you ask it to do first? Two or three sentences. Concrete examples welcome - 'help me draft the renewal pipeline report explanation' is more useful than 'help with reports.'</w:t>
+        <w:t>Section 4: Active Flows You Know About</w:t>
       </w:r>
     </w:p>
     <w:p>
       <w:r>
         <w:rPr>
-          <w:b/>
+          <w:i/>
         </w:rPr>
-        <w:t>Your answer:</w:t>
+        <w:t>Note: Adam owns all Flows at STA - you don’t need to name specific flows or know their technical details.</w:t>
       </w:r>
     </w:p>
     <w:p>
       <w:r>
-        <w:t>&gt;</w:t>
+        <w:t>Describe any automation behavior you depend on or that surprises you. You don’t need to name the flow - just describe what you observe (e.g., “when I close an Opp as Won, a Case gets created automatically”). Write N/A if none comes to mind:</w:t>
+      </w:r>
+    </w:p>
+    <w:p>
+      <w:r>
+        <w:t xml:space="preserve">&gt; </w:t>
+      </w:r>
+    </w:p>
+    <w:p>
+      <w:pPr>
+        <w:pStyle w:val="Heading1"/>
+      </w:pPr>
+      <w:r>
+        <w:t>Section 5: Validation Rules You Know About</w:t>
+      </w:r>
+    </w:p>
+    <w:p>
+      <w:r>
+        <w:rPr>
+          <w:i/>
+        </w:rPr>
+        <w:t>Note: The full list of STA-authored validation rules (14 rules) is already captured in the org context file. You don’t need to enumerate them here.</w:t>
+      </w:r>
+    </w:p>
+    <w:p>
+      <w:r>
+        <w:t>Which validation rule error messages regularly block you or your team? Describe the scenario (e.g., “when I try to close a Migration Case I get a message about required fields”). Write N/A if none come to mind:</w:t>
+      </w:r>
+    </w:p>
+    <w:p>
+      <w:r>
+        <w:t xml:space="preserve">&gt; </w:t>
+      </w:r>
+    </w:p>
+    <w:p>
+      <w:pPr>
+        <w:pStyle w:val="Heading1"/>
+      </w:pPr>
+      <w:r>
+        <w:t>Section 6: Reports and Dashboards You Use</w:t>
+      </w:r>
+    </w:p>
+    <w:p>
+      <w:r>
+        <w:t>List the reports and dashboards you use regularly. Group by function (finance, renewals, orders, support, marketing, etc.). Include the report or dashboard name and one sentence on what it shows.</w:t>
+      </w:r>
+    </w:p>
+    <w:p>
+      <w:r>
+        <w:t>Reports you use regularly:</w:t>
+      </w:r>
+    </w:p>
+    <w:p>
+      <w:r>
+        <w:t>1. Report name and what it shows:</w:t>
+      </w:r>
+    </w:p>
+    <w:p>
+      <w:r>
+        <w:t xml:space="preserve">&gt; </w:t>
+      </w:r>
+    </w:p>
+    <w:p>
+      <w:r>
+        <w:t>2. Report name and what it shows:</w:t>
+      </w:r>
+    </w:p>
+    <w:p>
+      <w:r>
+        <w:t xml:space="preserve">&gt; </w:t>
+      </w:r>
+    </w:p>
+    <w:p>
+      <w:r>
+        <w:t>3. Report name and what it shows:</w:t>
+      </w:r>
+    </w:p>
+    <w:p>
+      <w:r>
+        <w:t xml:space="preserve">&gt; </w:t>
+      </w:r>
+    </w:p>
+    <w:p>
+      <w:r>
+        <w:t>4. Report name and what it shows:</w:t>
+      </w:r>
+    </w:p>
+    <w:p>
+      <w:r>
+        <w:t xml:space="preserve">&gt; </w:t>
+      </w:r>
+    </w:p>
+    <w:p>
+      <w:r>
+        <w:t>5. Report name and what it shows:</w:t>
+      </w:r>
+    </w:p>
+    <w:p>
+      <w:r>
+        <w:t xml:space="preserve">&gt; </w:t>
+      </w:r>
+    </w:p>
+    <w:p>
+      <w:r>
+        <w:t>6. Report name and what it shows:</w:t>
+      </w:r>
+    </w:p>
+    <w:p>
+      <w:r>
+        <w:t xml:space="preserve">&gt; </w:t>
+      </w:r>
+    </w:p>
+    <w:p>
+      <w:r>
+        <w:t>7. Report name and what it shows:</w:t>
+      </w:r>
+    </w:p>
+    <w:p>
+      <w:r>
+        <w:t xml:space="preserve">&gt; </w:t>
+      </w:r>
+    </w:p>
+    <w:p>
+      <w:r>
+        <w:t>Dashboards you use regularly:</w:t>
+      </w:r>
+    </w:p>
+    <w:p>
+      <w:r>
+        <w:t>1. Dashboard name and what it shows:</w:t>
+      </w:r>
+    </w:p>
+    <w:p>
+      <w:r>
+        <w:t xml:space="preserve">&gt; </w:t>
+      </w:r>
+    </w:p>
+    <w:p>
+      <w:r>
+        <w:t>2. Dashboard name and what it shows:</w:t>
+      </w:r>
+    </w:p>
+    <w:p>
+      <w:r>
+        <w:t xml:space="preserve">&gt; </w:t>
+      </w:r>
+    </w:p>
+    <w:p>
+      <w:r>
+        <w:t>3. Dashboard name and what it shows:</w:t>
+      </w:r>
+    </w:p>
+    <w:p>
+      <w:r>
+        <w:t xml:space="preserve">&gt; </w:t>
+      </w:r>
+    </w:p>
+    <w:p>
+      <w:r>
+        <w:t>4. Dashboard name and what it shows:</w:t>
+      </w:r>
+    </w:p>
+    <w:p>
+      <w:r>
+        <w:t xml:space="preserve">&gt; </w:t>
+      </w:r>
+    </w:p>
+    <w:p>
+      <w:pPr>
+        <w:pStyle w:val="Heading1"/>
+      </w:pPr>
+      <w:r>
+        <w:t>Section 7: Permission Sets and Profiles</w:t>
+      </w:r>
+    </w:p>
+    <w:p>
+      <w:r>
+        <w:t>List any permission sets you use, manage, or have noticed cause friction (users locked out, surprising access patterns, etc.). Skip if you do not work with permission sets.</w:t>
+      </w:r>
+    </w:p>
+    <w:p>
+      <w:r>
+        <w:t>Permission sets you assign or manage:</w:t>
+      </w:r>
+    </w:p>
+    <w:p>
+      <w:r>
+        <w:t xml:space="preserve">&gt; </w:t>
+      </w:r>
+    </w:p>
+    <w:p>
+      <w:r>
+        <w:t>Profiles in active use at STA (e.g., System Administrator, Standard User, custom profiles):</w:t>
+      </w:r>
+    </w:p>
+    <w:p>
+      <w:r>
+        <w:t xml:space="preserve">&gt; </w:t>
+      </w:r>
+    </w:p>
+    <w:p>
+      <w:r>
+        <w:t>Any non-standard access patterns worth flagging (e.g., 'only Adam and Kelsey have Spanning access', 'Tanya is on a custom profile with extra report folder access'):</w:t>
+      </w:r>
+    </w:p>
+    <w:p>
+      <w:r>
+        <w:t xml:space="preserve">&gt; </w:t>
+      </w:r>
+    </w:p>
+    <w:p>
+      <w:pPr>
+        <w:pStyle w:val="Heading1"/>
+      </w:pPr>
+      <w:r>
+        <w:t>Section 8: Approval Processes</w:t>
+      </w:r>
+    </w:p>
+    <w:p>
+      <w:r>
+        <w:t>Approval processes route records to an approver who must click Approve or Reject before the record moves forward. List any approval processes active at STA - by name or by what they do.</w:t>
+      </w:r>
+    </w:p>
+    <w:p>
+      <w:pPr>
+        <w:pStyle w:val="Heading3"/>
+      </w:pPr>
+      <w:r>
+        <w:t>Approval Process 1</w:t>
+      </w:r>
+    </w:p>
+    <w:p>
+      <w:r>
+        <w:t>Process name or what it approves:</w:t>
+      </w:r>
+    </w:p>
+    <w:p>
+      <w:r>
+        <w:t xml:space="preserve">&gt; </w:t>
+      </w:r>
+    </w:p>
+    <w:p>
+      <w:r>
+        <w:t>Object it lives on:</w:t>
+      </w:r>
+    </w:p>
+    <w:p>
+      <w:r>
+        <w:t xml:space="preserve">&gt; </w:t>
+      </w:r>
+    </w:p>
+    <w:p>
+      <w:r>
+        <w:t>Who is the approver (specific user, role, or queue):</w:t>
+      </w:r>
+    </w:p>
+    <w:p>
+      <w:r>
+        <w:t xml:space="preserve">&gt; </w:t>
+      </w:r>
+    </w:p>
+    <w:p>
+      <w:r>
+        <w:t>When it fires (the trigger condition):</w:t>
+      </w:r>
+    </w:p>
+    <w:p>
+      <w:r>
+        <w:t xml:space="preserve">&gt; </w:t>
+      </w:r>
+    </w:p>
+    <w:p>
+      <w:pPr>
+        <w:pStyle w:val="Heading3"/>
+      </w:pPr>
+      <w:r>
+        <w:t>Approval Process 2</w:t>
+      </w:r>
+    </w:p>
+    <w:p>
+      <w:r>
+        <w:t>Process name or what it approves:</w:t>
+      </w:r>
+    </w:p>
+    <w:p>
+      <w:r>
+        <w:t xml:space="preserve">&gt; </w:t>
+      </w:r>
+    </w:p>
+    <w:p>
+      <w:r>
+        <w:t>Object it lives on:</w:t>
+      </w:r>
+    </w:p>
+    <w:p>
+      <w:r>
+        <w:t xml:space="preserve">&gt; </w:t>
+      </w:r>
+    </w:p>
+    <w:p>
+      <w:r>
+        <w:t>Who is the approver (specific user, role, or queue):</w:t>
+      </w:r>
+    </w:p>
+    <w:p>
+      <w:r>
+        <w:t xml:space="preserve">&gt; </w:t>
+      </w:r>
+    </w:p>
+    <w:p>
+      <w:r>
+        <w:t>When it fires (the trigger condition):</w:t>
+      </w:r>
+    </w:p>
+    <w:p>
+      <w:r>
+        <w:t xml:space="preserve">&gt; </w:t>
+      </w:r>
+    </w:p>
+    <w:p>
+      <w:pPr>
+        <w:pStyle w:val="Heading3"/>
+      </w:pPr>
+      <w:r>
+        <w:t>Approval Process 3</w:t>
+      </w:r>
+    </w:p>
+    <w:p>
+      <w:r>
+        <w:t>Process name or what it approves:</w:t>
+      </w:r>
+    </w:p>
+    <w:p>
+      <w:r>
+        <w:t xml:space="preserve">&gt; </w:t>
+      </w:r>
+    </w:p>
+    <w:p>
+      <w:r>
+        <w:t>Object it lives on:</w:t>
+      </w:r>
+    </w:p>
+    <w:p>
+      <w:r>
+        <w:t xml:space="preserve">&gt; </w:t>
+      </w:r>
+    </w:p>
+    <w:p>
+      <w:r>
+        <w:t>Who is the approver (specific user, role, or queue):</w:t>
+      </w:r>
+    </w:p>
+    <w:p>
+      <w:r>
+        <w:t xml:space="preserve">&gt; </w:t>
+      </w:r>
+    </w:p>
+    <w:p>
+      <w:r>
+        <w:t>When it fires (the trigger condition):</w:t>
+      </w:r>
+    </w:p>
+    <w:p>
+      <w:r>
+        <w:t xml:space="preserve">&gt; </w:t>
+      </w:r>
+    </w:p>
+    <w:p>
+      <w:pPr>
+        <w:pStyle w:val="Heading3"/>
+      </w:pPr>
+      <w:r>
+        <w:t>Approval Process 4</w:t>
+      </w:r>
+    </w:p>
+    <w:p>
+      <w:r>
+        <w:t>Process name or what it approves:</w:t>
+      </w:r>
+    </w:p>
+    <w:p>
+      <w:r>
+        <w:t xml:space="preserve">&gt; </w:t>
+      </w:r>
+    </w:p>
+    <w:p>
+      <w:r>
+        <w:t>Object it lives on:</w:t>
+      </w:r>
+    </w:p>
+    <w:p>
+      <w:r>
+        <w:t xml:space="preserve">&gt; </w:t>
+      </w:r>
+    </w:p>
+    <w:p>
+      <w:r>
+        <w:t>Who is the approver (specific user, role, or queue):</w:t>
+      </w:r>
+    </w:p>
+    <w:p>
+      <w:r>
+        <w:t xml:space="preserve">&gt; </w:t>
+      </w:r>
+    </w:p>
+    <w:p>
+      <w:r>
+        <w:t>When it fires (the trigger condition):</w:t>
+      </w:r>
+    </w:p>
+    <w:p>
+      <w:r>
+        <w:t xml:space="preserve">&gt; </w:t>
+      </w:r>
+    </w:p>
+    <w:p>
+      <w:pPr>
+        <w:pStyle w:val="Heading1"/>
+      </w:pPr>
+      <w:r>
+        <w:t>Section 9: CPQ Configuration (Joanie + Adam mainly)</w:t>
+      </w:r>
+    </w:p>
+    <w:p>
+      <w:r>
+        <w:t>Salesforce CPQ handles product configuration, pricing rules, quotes, and approvals on the sales side. Fill out what you know; skip if you do not work with CPQ.</w:t>
+      </w:r>
+    </w:p>
+    <w:p>
+      <w:r>
+        <w:t>Products in the CPQ catalog you work with most often:</w:t>
+      </w:r>
+    </w:p>
+    <w:p>
+      <w:r>
+        <w:t xml:space="preserve">&gt; </w:t>
+      </w:r>
+    </w:p>
+    <w:p>
+      <w:r>
+        <w:t>Price books in active use (e.g., 'Standard', 'WSIPC', 'Discounted'):</w:t>
+      </w:r>
+    </w:p>
+    <w:p>
+      <w:r>
+        <w:t xml:space="preserve">&gt; </w:t>
+      </w:r>
+    </w:p>
+    <w:p>
+      <w:r>
+        <w:t>Discount schedules in active use:</w:t>
+      </w:r>
+    </w:p>
+    <w:p>
+      <w:r>
+        <w:t xml:space="preserve">&gt; </w:t>
+      </w:r>
+    </w:p>
+    <w:p>
+      <w:r>
+        <w:t>Quote template(s) you use:</w:t>
+      </w:r>
+    </w:p>
+    <w:p>
+      <w:r>
+        <w:t xml:space="preserve">&gt; </w:t>
+      </w:r>
+    </w:p>
+    <w:p>
+      <w:r>
+        <w:t>Approval rules tied to CPQ (e.g., discount-over-X requires manager approval):</w:t>
+      </w:r>
+    </w:p>
+    <w:p>
+      <w:r>
+        <w:t xml:space="preserve">&gt; </w:t>
+      </w:r>
+    </w:p>
+    <w:p>
+      <w:r>
+        <w:t>Document templates for generated quotes/proposals:</w:t>
+      </w:r>
+    </w:p>
+    <w:p>
+      <w:r>
+        <w:t xml:space="preserve">&gt; </w:t>
+      </w:r>
+    </w:p>
+    <w:p>
+      <w:pPr>
+        <w:pStyle w:val="Heading1"/>
+      </w:pPr>
+      <w:r>
+        <w:t>Section 10: Spanning Backup</w:t>
+      </w:r>
+    </w:p>
+    <w:p>
+      <w:r>
+        <w:t>Spanning is the backup product for Salesforce data and metadata. Most cohort members will not have Spanning access; that is fine. Fill out only what applies.</w:t>
+      </w:r>
+    </w:p>
+    <w:p>
+      <w:r>
+        <w:t>Do you have Spanning access?</w:t>
+      </w:r>
+    </w:p>
+    <w:p>
+      <w:r>
+        <w:t xml:space="preserve">&gt; </w:t>
+      </w:r>
+    </w:p>
+    <w:p>
+      <w:r>
+        <w:t>If yes, what does the backup schedule look like (daily, hourly, etc.)?</w:t>
+      </w:r>
+    </w:p>
+    <w:p>
+      <w:r>
+        <w:t xml:space="preserve">&gt; </w:t>
+      </w:r>
+    </w:p>
+    <w:p>
+      <w:r>
+        <w:t>Have you ever needed to restore from Spanning? Briefly describe what happened and how it went:</w:t>
+      </w:r>
+    </w:p>
+    <w:p>
+      <w:r>
+        <w:t xml:space="preserve">&gt; </w:t>
+      </w:r>
+    </w:p>
+    <w:p>
+      <w:pPr>
+        <w:pStyle w:val="Heading1"/>
+      </w:pPr>
+      <w:r>
+        <w:t>Section 11: Integrations</w:t>
+      </w:r>
+    </w:p>
+    <w:p>
+      <w:r>
+        <w:t>STA's Salesforce integrates with several other systems. List which integrations touch your work and what they sync. Examples: Skyward, WooCommerce, Stripe, Mailchimp, eFunds, custom APIs.</w:t>
+      </w:r>
+    </w:p>
+    <w:p>
+      <w:pPr>
+        <w:pStyle w:val="Heading3"/>
+      </w:pPr>
+      <w:r>
+        <w:t>Integration 1</w:t>
+      </w:r>
+    </w:p>
+    <w:p>
+      <w:r>
+        <w:t>System name:</w:t>
+      </w:r>
+    </w:p>
+    <w:p>
+      <w:r>
+        <w:t xml:space="preserve">&gt; </w:t>
+      </w:r>
+    </w:p>
+    <w:p>
+      <w:r>
+        <w:t>What data flows in or out of Salesforce:</w:t>
+      </w:r>
+    </w:p>
+    <w:p>
+      <w:r>
+        <w:t xml:space="preserve">&gt; </w:t>
+      </w:r>
+    </w:p>
+    <w:p>
+      <w:r>
+        <w:t>How often (real-time, nightly, on-demand):</w:t>
+      </w:r>
+    </w:p>
+    <w:p>
+      <w:r>
+        <w:t xml:space="preserve">&gt; </w:t>
+      </w:r>
+    </w:p>
+    <w:p>
+      <w:pPr>
+        <w:pStyle w:val="Heading3"/>
+      </w:pPr>
+      <w:r>
+        <w:t>Integration 2</w:t>
+      </w:r>
+    </w:p>
+    <w:p>
+      <w:r>
+        <w:t>System name:</w:t>
+      </w:r>
+    </w:p>
+    <w:p>
+      <w:r>
+        <w:t xml:space="preserve">&gt; </w:t>
+      </w:r>
+    </w:p>
+    <w:p>
+      <w:r>
+        <w:t>What data flows in or out of Salesforce:</w:t>
+      </w:r>
+    </w:p>
+    <w:p>
+      <w:r>
+        <w:t xml:space="preserve">&gt; </w:t>
+      </w:r>
+    </w:p>
+    <w:p>
+      <w:r>
+        <w:t>How often (real-time, nightly, on-demand):</w:t>
+      </w:r>
+    </w:p>
+    <w:p>
+      <w:r>
+        <w:t xml:space="preserve">&gt; </w:t>
+      </w:r>
+    </w:p>
+    <w:p>
+      <w:pPr>
+        <w:pStyle w:val="Heading3"/>
+      </w:pPr>
+      <w:r>
+        <w:t>Integration 3</w:t>
+      </w:r>
+    </w:p>
+    <w:p>
+      <w:r>
+        <w:t>System name:</w:t>
+      </w:r>
+    </w:p>
+    <w:p>
+      <w:r>
+        <w:t xml:space="preserve">&gt; </w:t>
+      </w:r>
+    </w:p>
+    <w:p>
+      <w:r>
+        <w:t>What data flows in or out of Salesforce:</w:t>
+      </w:r>
+    </w:p>
+    <w:p>
+      <w:r>
+        <w:t xml:space="preserve">&gt; </w:t>
+      </w:r>
+    </w:p>
+    <w:p>
+      <w:r>
+        <w:t>How often (real-time, nightly, on-demand):</w:t>
+      </w:r>
+    </w:p>
+    <w:p>
+      <w:r>
+        <w:t xml:space="preserve">&gt; </w:t>
+      </w:r>
+    </w:p>
+    <w:p>
+      <w:pPr>
+        <w:pStyle w:val="Heading3"/>
+      </w:pPr>
+      <w:r>
+        <w:t>Integration 4</w:t>
+      </w:r>
+    </w:p>
+    <w:p>
+      <w:r>
+        <w:t>System name:</w:t>
+      </w:r>
+    </w:p>
+    <w:p>
+      <w:r>
+        <w:t xml:space="preserve">&gt; </w:t>
+      </w:r>
+    </w:p>
+    <w:p>
+      <w:r>
+        <w:t>What data flows in or out of Salesforce:</w:t>
+      </w:r>
+    </w:p>
+    <w:p>
+      <w:r>
+        <w:t xml:space="preserve">&gt; </w:t>
+      </w:r>
+    </w:p>
+    <w:p>
+      <w:r>
+        <w:t>How often (real-time, nightly, on-demand):</w:t>
+      </w:r>
+    </w:p>
+    <w:p>
+      <w:r>
+        <w:t xml:space="preserve">&gt; </w:t>
+      </w:r>
+    </w:p>
+    <w:p>
+      <w:pPr>
+        <w:pStyle w:val="Heading3"/>
+      </w:pPr>
+      <w:r>
+        <w:t>Integration 5</w:t>
+      </w:r>
+    </w:p>
+    <w:p>
+      <w:r>
+        <w:t>System name:</w:t>
+      </w:r>
+    </w:p>
+    <w:p>
+      <w:r>
+        <w:t xml:space="preserve">&gt; </w:t>
+      </w:r>
+    </w:p>
+    <w:p>
+      <w:r>
+        <w:t>What data flows in or out of Salesforce:</w:t>
+      </w:r>
+    </w:p>
+    <w:p>
+      <w:r>
+        <w:t xml:space="preserve">&gt; </w:t>
+      </w:r>
+    </w:p>
+    <w:p>
+      <w:r>
+        <w:t>How often (real-time, nightly, on-demand):</w:t>
+      </w:r>
+    </w:p>
+    <w:p>
+      <w:r>
+        <w:t xml:space="preserve">&gt; </w:t>
+      </w:r>
+    </w:p>
+    <w:p>
+      <w:pPr>
+        <w:pStyle w:val="Heading1"/>
+      </w:pPr>
+      <w:r>
+        <w:t>Section 12: Email Templates and Letterheads</w:t>
+      </w:r>
+    </w:p>
+    <w:p>
+      <w:r>
+        <w:t>List any email templates or letterheads in Salesforce that you use to send customer communications - quote follow-ups, renewal notices, support replies, marketing emails, etc.</w:t>
+      </w:r>
+    </w:p>
+    <w:p>
+      <w:r>
+        <w:t>Templates you use regularly:</w:t>
+      </w:r>
+    </w:p>
+    <w:p>
+      <w:r>
+        <w:t xml:space="preserve">&gt; </w:t>
+      </w:r>
+    </w:p>
+    <w:p>
+      <w:r>
+        <w:t>Letterhead(s) currently active:</w:t>
+      </w:r>
+    </w:p>
+    <w:p>
+      <w:r>
+        <w:t xml:space="preserve">&gt; </w:t>
+      </w:r>
+    </w:p>
+    <w:p>
+      <w:pPr>
+        <w:pStyle w:val="Heading1"/>
+      </w:pPr>
+      <w:r>
+        <w:t>Section 13: Salesforce-Specific Friction Points</w:t>
+      </w:r>
+    </w:p>
+    <w:p>
+      <w:r>
+        <w:t>Anything Salesforce-specific the cohort assistant should know? This section deliberately scopes to Salesforce structural quirks, not general work pain points (those live in the Department AI Workflow Planner).</w:t>
+      </w:r>
+    </w:p>
+    <w:p>
+      <w:r>
+        <w:t>Things in the Salesforce org that are non-obvious or counter-intuitive (e.g., 'we use the standard Lead Source field for something other than lead source', 'the Opportunity object stores renewals via a custom record type'):</w:t>
+      </w:r>
+    </w:p>
+    <w:p>
+      <w:r>
+        <w:t xml:space="preserve">&gt; </w:t>
+      </w:r>
+    </w:p>
+    <w:p>
+      <w:r>
+        <w:t>Salesforce automations that have edge-case behavior you have to remember (e.g., 'this validation rule fires on every save not just create'):</w:t>
+      </w:r>
+    </w:p>
+    <w:p>
+      <w:r>
+        <w:t xml:space="preserve">&gt; </w:t>
+      </w:r>
+    </w:p>
+    <w:p>
+      <w:r>
+        <w:t>Salesforce features or packages we have but you wish were configured differently:</w:t>
+      </w:r>
+    </w:p>
+    <w:p>
+      <w:r>
+        <w:t xml:space="preserve">&gt; </w:t>
+      </w:r>
+    </w:p>
+    <w:p>
+      <w:r>
+        <w:t>Anything else Salesforce-structural:</w:t>
+      </w:r>
+    </w:p>
+    <w:p>
+      <w:r>
+        <w:t xml:space="preserve">&gt; </w:t>
+      </w:r>
+    </w:p>
+    <w:p>
+      <w:pPr>
+        <w:spacing w:before="360"/>
+      </w:pPr>
+      <w:r>
+        <w:rPr>
+          <w:i/>
+          <w:color w:val="5A5F72"/>
+          <w:sz w:val="20"/>
+        </w:rPr>
+        <w:t>Return this file to Adam when complete. Filled answers feed v1.1 of the cohort assistant's STA Salesforce org context file. Broader workflow questions live in the separate Department AI Workflow Planner.</w:t>
       </w:r>
     </w:p>
     <w:sectPr>
@@ -562,7 +1710,7 @@
     <w:qFormat/>
     <w:rsid w:val="00FC693F"/>
     <w:pPr>
-      <w:spacing w:line="300" w:lineRule="auto" w:after="120"/>
+      <w:spacing w:after="120" w:line="300" w:lineRule="auto"/>
     </w:pPr>
     <w:rPr>
       <w:rFonts w:ascii="Calibri" w:hAnsi="Calibri"/>
@@ -628,10 +1776,10 @@
       <w:outlineLvl w:val="0"/>
     </w:pPr>
     <w:rPr>
-      <w:rFonts w:asciiTheme="majorHAnsi" w:eastAsiaTheme="majorEastAsia" w:hAnsiTheme="majorHAnsi" w:cstheme="majorBidi" w:ascii="Calibri" w:hAnsi="Calibri"/>
+      <w:rFonts w:asciiTheme="majorHAnsi" w:eastAsiaTheme="majorEastAsia" w:hAnsiTheme="majorHAnsi" w:cstheme="majorBidi"/>
       <w:b/>
       <w:bCs/>
-      <w:color w:val="1F3A5F"/>
+      <w:color w:val="006098"/>
       <w:sz w:val="36"/>
       <w:szCs w:val="28"/>
     </w:rPr>
@@ -652,10 +1800,10 @@
       <w:outlineLvl w:val="1"/>
     </w:pPr>
     <w:rPr>
-      <w:rFonts w:asciiTheme="majorHAnsi" w:eastAsiaTheme="majorEastAsia" w:hAnsiTheme="majorHAnsi" w:cstheme="majorBidi" w:ascii="Calibri" w:hAnsi="Calibri"/>
+      <w:rFonts w:asciiTheme="majorHAnsi" w:eastAsiaTheme="majorEastAsia" w:hAnsiTheme="majorHAnsi" w:cstheme="majorBidi"/>
       <w:b/>
       <w:bCs/>
-      <w:color w:val="1F3A5F"/>
+      <w:color w:val="006098"/>
       <w:sz w:val="28"/>
       <w:szCs w:val="26"/>
     </w:rPr>
@@ -672,14 +1820,15 @@
     <w:pPr>
       <w:keepNext/>
       <w:keepLines/>
-      <w:spacing w:before="200" w:after="0"/>
+      <w:spacing w:before="160" w:after="80"/>
       <w:outlineLvl w:val="2"/>
     </w:pPr>
     <w:rPr>
       <w:rFonts w:asciiTheme="majorHAnsi" w:eastAsiaTheme="majorEastAsia" w:hAnsiTheme="majorHAnsi" w:cstheme="majorBidi"/>
       <w:b/>
       <w:bCs/>
-      <w:color w:val="4F81BD" w:themeColor="accent1"/>
+      <w:color w:val="1A1A2E"/>
+      <w:sz w:val="24"/>
     </w:rPr>
   </w:style>
   <w:style w:type="paragraph" w:styleId="Heading4">

</xml_diff>